<commit_message>
feat: lengkapi gambar laporan - use case, ERD, dan screenshot aplikasi di docx
</commit_message>
<xml_diff>
--- a/Laporan_Bisnis_Project_PPLG_Perpustakaan.docx
+++ b/Laporan_Bisnis_Project_PPLG_Perpustakaan.docx
@@ -10390,6 +10390,7 @@
           <w:color w:val="000000"/>
           <w:sz w:val="20"/>
         </w:rPr>
+        <w:lastRenderedPageBreak/>
         <w:drawing>
           <wp:inline distT="0" distB="0" distL="0" distR="0" wp14:anchorId="6A9D0CC8" wp14:editId="009BC669">
             <wp:extent cx="5219700" cy="7239000"/>
@@ -10450,7 +10451,6 @@
           <w:color w:val="000000"/>
           <w:sz w:val="24"/>
         </w:rPr>
-        <w:lastRenderedPageBreak/>
         <w:t>4.3 Use Case Diagram</w:t>
       </w:r>
       <w:bookmarkEnd w:id="34"/>
@@ -10486,14 +10486,87 @@
           <w:sz w:val="20"/>
         </w:rPr>
       </w:pPr>
-      <w:r>
+    </w:p>
+    <w:p>
+      <w:pPr>
+        <w:spacing w:after="120" w:line="240" w:lineRule="auto"/>
+        <w:jc w:val="center"/>
         <w:rPr>
           <w:rFonts w:ascii="Times New Roman" w:hAnsi="Times New Roman" w:cs="Times New Roman"/>
           <w:i/>
           <w:color w:val="000000"/>
           <w:sz w:val="20"/>
         </w:rPr>
-        <w:t>[Gambar 4.4: Use Case Diagram - sisipkan diagram]</w:t>
+      </w:pPr>
+      <w:r>
+        <w:rPr>
+          <w:rFonts w:ascii="Times New Roman" w:hAnsi="Times New Roman" w:cs="Times New Roman"/>
+          <w:i/>
+          <w:color w:val="000000"/>
+          <w:sz w:val="20"/>
+        </w:rPr>
+        <w:t>Gambar 4.4 Use Case Diagram Sistem Perpustakaan Sekolah</w:t>
+      </w:r>
+    </w:p>
+    <w:p>
+      <w:pPr>
+        <w:spacing w:after="120" w:line="240" w:lineRule="auto"/>
+        <w:jc w:val="center"/>
+        <w:rPr>
+          <w:rFonts w:ascii="Times New Roman" w:hAnsi="Times New Roman" w:cs="Times New Roman"/>
+          <w:i/>
+          <w:color w:val="000000"/>
+          <w:sz w:val="20"/>
+        </w:rPr>
+      </w:pPr>
+      <w:r>
+        <w:rPr>
+          <w:rFonts w:ascii="Times New Roman" w:hAnsi="Times New Roman" w:cs="Times New Roman"/>
+          <w:i/>
+          <w:noProof/>
+          <w:color w:val="000000"/>
+          <w:sz w:val="20"/>
+        </w:rPr>
+        <w:lastRenderedPageBreak/>
+        <w:drawing>
+          <wp:inline distT="0" distB="0" distL="0" distR="0" wp14:anchorId="1A80D530" wp14:editId="1FFD986A">
+            <wp:extent cx="5219700" cy="5435600"/>
+            <wp:effectExtent l="0" t="0" r="0" b="0"/>
+            <wp:docPr id="62066609" name="Picture 1"/>
+            <wp:cNvGraphicFramePr/>
+            <a:graphic xmlns:a="http://schemas.openxmlformats.org/drawingml/2006/main">
+              <a:graphicData uri="http://schemas.openxmlformats.org/drawingml/2006/picture">
+                <pic:pic xmlns:pic="http://schemas.openxmlformats.org/drawingml/2006/picture">
+                  <pic:nvPicPr>
+                    <pic:cNvPr id="62066609" name=""/>
+                    <pic:cNvPicPr/>
+                  </pic:nvPicPr>
+                  <pic:blipFill>
+                    <a:blip r:embed="rId9" cstate="print">
+                      <a:extLst>
+                        <a:ext uri="{28A0092B-C50C-407E-A947-70E740481C1C}">
+                          <a14:useLocalDpi xmlns:a14="http://schemas.microsoft.com/office/drawing/2010/main" val="0"/>
+                        </a:ext>
+                      </a:extLst>
+                    </a:blip>
+                    <a:stretch>
+                      <a:fillRect/>
+                    </a:stretch>
+                  </pic:blipFill>
+                  <pic:spPr>
+                    <a:xfrm>
+                      <a:off x="0" y="0"/>
+                      <a:ext cx="5219700" cy="5435600"/>
+                    </a:xfrm>
+                    <a:prstGeom prst="rect">
+                      <a:avLst/>
+                    </a:prstGeom>
+                  </pic:spPr>
+                </pic:pic>
+              </a:graphicData>
+            </a:graphic>
+          </wp:inline>
+        </w:drawing>
       </w:r>
     </w:p>
     <w:tbl>
@@ -10620,7 +10693,16 @@
                 <w:i/>
                 <w:color w:val="000000"/>
               </w:rPr>
-              <w:t>Login, mengelola buku, mengelola anggota, meminjamkan buku, menerima pengembalian, membayar denda, melihat statistik, mengekspor laporan, mencetak label QR</w:t>
+              <w:t>Login, mengelola buku, mengelola anggota, meminjamkan buku, menerima pengembalian, membay</w:t>
+            </w:r>
+            <w:r>
+              <w:rPr>
+                <w:rFonts w:ascii="Times New Roman" w:hAnsi="Times New Roman" w:cs="Times New Roman"/>
+                <w:i/>
+                <w:color w:val="000000"/>
+              </w:rPr>
+              <w:lastRenderedPageBreak/>
+              <w:t>ar denda, melihat statistik, mengekspor laporan, mencetak label QR</w:t>
             </w:r>
           </w:p>
         </w:tc>
@@ -10649,6 +10731,7 @@
                 <w:i/>
                 <w:color w:val="000000"/>
               </w:rPr>
+              <w:lastRenderedPageBreak/>
               <w:t>Staff</w:t>
             </w:r>
           </w:p>
@@ -10726,16 +10809,7 @@
                 <w:i/>
                 <w:color w:val="000000"/>
               </w:rPr>
-              <w:t xml:space="preserve">Login, melihat daftar </w:t>
-            </w:r>
-            <w:r>
-              <w:rPr>
-                <w:rFonts w:ascii="Times New Roman" w:hAnsi="Times New Roman" w:cs="Times New Roman"/>
-                <w:i/>
-                <w:color w:val="000000"/>
-              </w:rPr>
-              <w:lastRenderedPageBreak/>
-              <w:t>buku, meminjam buku, melihat riwayat peminjaman</w:t>
+              <w:t>Login, melihat daftar buku, meminjam buku, melihat riwayat peminjaman</w:t>
             </w:r>
           </w:p>
         </w:tc>
@@ -10865,14 +10939,87 @@
           <w:sz w:val="20"/>
         </w:rPr>
       </w:pPr>
-      <w:r>
+    </w:p>
+    <w:p>
+      <w:pPr>
+        <w:spacing w:after="120" w:line="240" w:lineRule="auto"/>
+        <w:jc w:val="center"/>
         <w:rPr>
           <w:rFonts w:ascii="Times New Roman" w:hAnsi="Times New Roman" w:cs="Times New Roman"/>
           <w:i/>
           <w:color w:val="000000"/>
           <w:sz w:val="20"/>
         </w:rPr>
-        <w:t>[Gambar 4.5: ERD - sisipkan diagram]</w:t>
+      </w:pPr>
+      <w:r>
+        <w:rPr>
+          <w:rFonts w:ascii="Times New Roman" w:hAnsi="Times New Roman" w:cs="Times New Roman"/>
+          <w:i/>
+          <w:color w:val="000000"/>
+          <w:sz w:val="20"/>
+        </w:rPr>
+        <w:t>Gambar 4.5 ERD Sistem Perpustakaan Sekolah</w:t>
+      </w:r>
+    </w:p>
+    <w:p>
+      <w:pPr>
+        <w:spacing w:after="120" w:line="240" w:lineRule="auto"/>
+        <w:jc w:val="center"/>
+        <w:rPr>
+          <w:rFonts w:ascii="Times New Roman" w:hAnsi="Times New Roman" w:cs="Times New Roman"/>
+          <w:i/>
+          <w:color w:val="000000"/>
+          <w:sz w:val="20"/>
+        </w:rPr>
+      </w:pPr>
+      <w:r>
+        <w:rPr>
+          <w:rFonts w:ascii="Times New Roman" w:hAnsi="Times New Roman" w:cs="Times New Roman"/>
+          <w:i/>
+          <w:noProof/>
+          <w:color w:val="000000"/>
+          <w:sz w:val="20"/>
+        </w:rPr>
+        <w:lastRenderedPageBreak/>
+        <w:drawing>
+          <wp:inline distT="0" distB="0" distL="0" distR="0" wp14:anchorId="3791B6D0" wp14:editId="19A66857">
+            <wp:extent cx="5219700" cy="4648200"/>
+            <wp:effectExtent l="0" t="0" r="0" b="0"/>
+            <wp:docPr id="466324360" name="Picture 2"/>
+            <wp:cNvGraphicFramePr/>
+            <a:graphic xmlns:a="http://schemas.openxmlformats.org/drawingml/2006/main">
+              <a:graphicData uri="http://schemas.openxmlformats.org/drawingml/2006/picture">
+                <pic:pic xmlns:pic="http://schemas.openxmlformats.org/drawingml/2006/picture">
+                  <pic:nvPicPr>
+                    <pic:cNvPr id="466324360" name=""/>
+                    <pic:cNvPicPr/>
+                  </pic:nvPicPr>
+                  <pic:blipFill>
+                    <a:blip r:embed="rId10" cstate="print">
+                      <a:extLst>
+                        <a:ext uri="{28A0092B-C50C-407E-A947-70E740481C1C}">
+                          <a14:useLocalDpi xmlns:a14="http://schemas.microsoft.com/office/drawing/2010/main" val="0"/>
+                        </a:ext>
+                      </a:extLst>
+                    </a:blip>
+                    <a:stretch>
+                      <a:fillRect/>
+                    </a:stretch>
+                  </pic:blipFill>
+                  <pic:spPr>
+                    <a:xfrm>
+                      <a:off x="0" y="0"/>
+                      <a:ext cx="5219700" cy="4648200"/>
+                    </a:xfrm>
+                    <a:prstGeom prst="rect">
+                      <a:avLst/>
+                    </a:prstGeom>
+                  </pic:spPr>
+                </pic:pic>
+              </a:graphicData>
+            </a:graphic>
+          </wp:inline>
+        </w:drawing>
       </w:r>
     </w:p>
     <w:p>
@@ -11184,7 +11331,14 @@
               <w:rPr>
                 <w:rFonts w:ascii="Times New Roman" w:hAnsi="Times New Roman" w:cs="Times New Roman"/>
               </w:rPr>
-              <w:t>Nama pengguna</w:t>
+              <w:t>Nama peng</w:t>
+            </w:r>
+            <w:r>
+              <w:rPr>
+                <w:rFonts w:ascii="Times New Roman" w:hAnsi="Times New Roman" w:cs="Times New Roman"/>
+              </w:rPr>
+              <w:lastRenderedPageBreak/>
+              <w:t>guna</w:t>
             </w:r>
           </w:p>
         </w:tc>
@@ -11202,7 +11356,15 @@
               <w:rPr>
                 <w:rFonts w:ascii="Times New Roman" w:hAnsi="Times New Roman" w:cs="Times New Roman"/>
               </w:rPr>
-              <w:t>Wajib diisi</w:t>
+              <w:lastRenderedPageBreak/>
+              <w:t xml:space="preserve">Wajib </w:t>
+            </w:r>
+            <w:r>
+              <w:rPr>
+                <w:rFonts w:ascii="Times New Roman" w:hAnsi="Times New Roman" w:cs="Times New Roman"/>
+              </w:rPr>
+              <w:lastRenderedPageBreak/>
+              <w:t>diisi</w:t>
             </w:r>
           </w:p>
         </w:tc>
@@ -11225,6 +11387,7 @@
               <w:rPr>
                 <w:rFonts w:ascii="Times New Roman" w:hAnsi="Times New Roman" w:cs="Times New Roman"/>
               </w:rPr>
+              <w:lastRenderedPageBreak/>
               <w:t>email</w:t>
             </w:r>
           </w:p>
@@ -11261,14 +11424,7 @@
               <w:rPr>
                 <w:rFonts w:ascii="Times New Roman" w:hAnsi="Times New Roman" w:cs="Times New Roman"/>
               </w:rPr>
-              <w:t>Email peng</w:t>
-            </w:r>
-            <w:r>
-              <w:rPr>
-                <w:rFonts w:ascii="Times New Roman" w:hAnsi="Times New Roman" w:cs="Times New Roman"/>
-              </w:rPr>
-              <w:lastRenderedPageBreak/>
-              <w:t>guna</w:t>
+              <w:t>Email pengguna</w:t>
             </w:r>
           </w:p>
         </w:tc>
@@ -11286,7 +11442,6 @@
               <w:rPr>
                 <w:rFonts w:ascii="Times New Roman" w:hAnsi="Times New Roman" w:cs="Times New Roman"/>
               </w:rPr>
-              <w:lastRenderedPageBreak/>
               <w:t>Unique</w:t>
             </w:r>
           </w:p>
@@ -11776,6 +11931,7 @@
               <w:rPr>
                 <w:rFonts w:ascii="Times New Roman" w:hAnsi="Times New Roman" w:cs="Times New Roman"/>
               </w:rPr>
+              <w:lastRenderedPageBreak/>
               <w:t>title</w:t>
             </w:r>
           </w:p>
@@ -12396,6 +12552,7 @@
               <w:rPr>
                 <w:rFonts w:ascii="Times New Roman" w:hAnsi="Times New Roman" w:cs="Times New Roman"/>
               </w:rPr>
+              <w:lastRenderedPageBreak/>
               <w:t>book_id</w:t>
             </w:r>
           </w:p>
@@ -12826,7 +12983,16 @@
           <w:color w:val="000000"/>
           <w:sz w:val="24"/>
         </w:rPr>
-        <w:t>Perancangan antarmuka (UI/UX) aplikasi menggunakan desain neo-brutalist, yaitu tampilan yang menggunakan warna-warna tegas (kuning, merah, biru), garis tepi tebal, bayangan kasar (hard shadow), serta sudut yang membulat pada elemen-elemennya. Desain ini dipilih agar tampilan aplikasi terlihat modern, mencolok, dan mudah dikenali, namun tetap nyaman digunakan.</w:t>
+        <w:t xml:space="preserve">Perancangan antarmuka (UI/UX) aplikasi menggunakan desain neo-brutalist, yaitu tampilan yang menggunakan warna-warna tegas (kuning, merah, biru), garis tepi tebal, bayangan kasar (hard shadow), serta sudut yang membulat </w:t>
+      </w:r>
+      <w:r>
+        <w:rPr>
+          <w:rFonts w:ascii="Times New Roman" w:hAnsi="Times New Roman" w:cs="Times New Roman"/>
+          <w:color w:val="000000"/>
+          <w:sz w:val="24"/>
+        </w:rPr>
+        <w:lastRenderedPageBreak/>
+        <w:t>pada elemen-elemennya. Desain ini dipilih agar tampilan aplikasi terlihat modern, mencolok, dan mudah dikenali, namun tetap nyaman digunakan.</w:t>
       </w:r>
     </w:p>
     <w:p>
@@ -12885,6 +13051,7 @@
           <w:color w:val="000000"/>
           <w:sz w:val="28"/>
         </w:rPr>
+        <w:lastRenderedPageBreak/>
         <w:t>BAB V</w:t>
       </w:r>
       <w:bookmarkEnd w:id="41"/>
@@ -13267,7 +13434,15 @@
                 <w:rFonts w:ascii="Times New Roman" w:hAnsi="Times New Roman" w:cs="Times New Roman"/>
                 <w:color w:val="000000"/>
               </w:rPr>
-              <w:t>Pustaka JavaScript untuk scan QR Code menggunakan kamera</w:t>
+              <w:t>Pustaka JavaScript untuk scan QR Code menggu</w:t>
+            </w:r>
+            <w:r>
+              <w:rPr>
+                <w:rFonts w:ascii="Times New Roman" w:hAnsi="Times New Roman" w:cs="Times New Roman"/>
+                <w:color w:val="000000"/>
+              </w:rPr>
+              <w:lastRenderedPageBreak/>
+              <w:t>nakan kamera</w:t>
             </w:r>
           </w:p>
         </w:tc>
@@ -13294,6 +13469,7 @@
                 <w:rFonts w:ascii="Times New Roman" w:hAnsi="Times New Roman" w:cs="Times New Roman"/>
                 <w:color w:val="000000"/>
               </w:rPr>
+              <w:lastRenderedPageBreak/>
               <w:t>Chart.js</w:t>
             </w:r>
           </w:p>
@@ -13507,15 +13683,6 @@
           <w:sz w:val="20"/>
         </w:rPr>
       </w:pPr>
-      <w:r>
-        <w:rPr>
-          <w:rFonts w:ascii="Times New Roman" w:hAnsi="Times New Roman" w:cs="Times New Roman"/>
-          <w:i/>
-          <w:color w:val="000000"/>
-          <w:sz w:val="20"/>
-        </w:rPr>
-        <w:t>[Gambar 5.1: Halaman Login - sisipkan screenshot]</w:t>
-      </w:r>
     </w:p>
     <w:p>
       <w:pPr>
@@ -13535,7 +13702,161 @@
           <w:color w:val="000000"/>
           <w:sz w:val="20"/>
         </w:rPr>
-        <w:t>[Gambar 5.2: Halaman Registrasi Anggota - sisipkan screenshot]</w:t>
+        <w:t>Gambar 5.1 Halaman Login</w:t>
+      </w:r>
+    </w:p>
+    <w:p>
+      <w:pPr>
+        <w:spacing w:after="120" w:line="240" w:lineRule="auto"/>
+        <w:jc w:val="center"/>
+        <w:rPr>
+          <w:rFonts w:ascii="Times New Roman" w:hAnsi="Times New Roman" w:cs="Times New Roman"/>
+          <w:i/>
+          <w:color w:val="000000"/>
+          <w:sz w:val="20"/>
+        </w:rPr>
+      </w:pPr>
+      <w:r>
+        <w:rPr>
+          <w:rFonts w:ascii="Times New Roman" w:hAnsi="Times New Roman" w:cs="Times New Roman"/>
+          <w:i/>
+          <w:noProof/>
+          <w:color w:val="000000"/>
+          <w:sz w:val="20"/>
+        </w:rPr>
+        <w:lastRenderedPageBreak/>
+        <w:drawing>
+          <wp:inline distT="0" distB="0" distL="0" distR="0" wp14:anchorId="4804AB95" wp14:editId="0CB86925">
+            <wp:extent cx="5219700" cy="3263900"/>
+            <wp:effectExtent l="0" t="0" r="0" b="0"/>
+            <wp:docPr id="100066703" name="Picture 3"/>
+            <wp:cNvGraphicFramePr/>
+            <a:graphic xmlns:a="http://schemas.openxmlformats.org/drawingml/2006/main">
+              <a:graphicData uri="http://schemas.openxmlformats.org/drawingml/2006/picture">
+                <pic:pic xmlns:pic="http://schemas.openxmlformats.org/drawingml/2006/picture">
+                  <pic:nvPicPr>
+                    <pic:cNvPr id="100066703" name=""/>
+                    <pic:cNvPicPr/>
+                  </pic:nvPicPr>
+                  <pic:blipFill>
+                    <a:blip r:embed="rId11" cstate="print">
+                      <a:extLst>
+                        <a:ext uri="{28A0092B-C50C-407E-A947-70E740481C1C}">
+                          <a14:useLocalDpi xmlns:a14="http://schemas.microsoft.com/office/drawing/2010/main" val="0"/>
+                        </a:ext>
+                      </a:extLst>
+                    </a:blip>
+                    <a:stretch>
+                      <a:fillRect/>
+                    </a:stretch>
+                  </pic:blipFill>
+                  <pic:spPr>
+                    <a:xfrm>
+                      <a:off x="0" y="0"/>
+                      <a:ext cx="5219700" cy="3263900"/>
+                    </a:xfrm>
+                    <a:prstGeom prst="rect">
+                      <a:avLst/>
+                    </a:prstGeom>
+                  </pic:spPr>
+                </pic:pic>
+              </a:graphicData>
+            </a:graphic>
+          </wp:inline>
+        </w:drawing>
+      </w:r>
+    </w:p>
+    <w:p>
+      <w:pPr>
+        <w:spacing w:after="120" w:line="240" w:lineRule="auto"/>
+        <w:jc w:val="center"/>
+        <w:rPr>
+          <w:rFonts w:ascii="Times New Roman" w:hAnsi="Times New Roman" w:cs="Times New Roman"/>
+          <w:i/>
+          <w:color w:val="000000"/>
+          <w:sz w:val="20"/>
+        </w:rPr>
+      </w:pPr>
+    </w:p>
+    <w:p>
+      <w:pPr>
+        <w:spacing w:after="120" w:line="240" w:lineRule="auto"/>
+        <w:jc w:val="center"/>
+        <w:rPr>
+          <w:rFonts w:ascii="Times New Roman" w:hAnsi="Times New Roman" w:cs="Times New Roman"/>
+          <w:i/>
+          <w:color w:val="000000"/>
+          <w:sz w:val="20"/>
+        </w:rPr>
+      </w:pPr>
+      <w:r>
+        <w:rPr>
+          <w:rFonts w:ascii="Times New Roman" w:hAnsi="Times New Roman" w:cs="Times New Roman"/>
+          <w:i/>
+          <w:color w:val="000000"/>
+          <w:sz w:val="20"/>
+        </w:rPr>
+        <w:t>Gambar 5.2 Halaman Registrasi Anggota</w:t>
+      </w:r>
+    </w:p>
+    <w:p>
+      <w:pPr>
+        <w:spacing w:after="120" w:line="240" w:lineRule="auto"/>
+        <w:jc w:val="center"/>
+        <w:rPr>
+          <w:rFonts w:ascii="Times New Roman" w:hAnsi="Times New Roman" w:cs="Times New Roman"/>
+          <w:i/>
+          <w:color w:val="000000"/>
+          <w:sz w:val="20"/>
+        </w:rPr>
+      </w:pPr>
+      <w:r>
+        <w:rPr>
+          <w:rFonts w:ascii="Times New Roman" w:hAnsi="Times New Roman" w:cs="Times New Roman"/>
+          <w:i/>
+          <w:noProof/>
+          <w:color w:val="000000"/>
+          <w:sz w:val="20"/>
+        </w:rPr>
+        <w:drawing>
+          <wp:inline distT="0" distB="0" distL="0" distR="0" wp14:anchorId="461ADB1C" wp14:editId="6118BA85">
+            <wp:extent cx="5219700" cy="3263900"/>
+            <wp:effectExtent l="0" t="0" r="0" b="0"/>
+            <wp:docPr id="1085753729" name="Picture 4"/>
+            <wp:cNvGraphicFramePr/>
+            <a:graphic xmlns:a="http://schemas.openxmlformats.org/drawingml/2006/main">
+              <a:graphicData uri="http://schemas.openxmlformats.org/drawingml/2006/picture">
+                <pic:pic xmlns:pic="http://schemas.openxmlformats.org/drawingml/2006/picture">
+                  <pic:nvPicPr>
+                    <pic:cNvPr id="1085753729" name=""/>
+                    <pic:cNvPicPr/>
+                  </pic:nvPicPr>
+                  <pic:blipFill>
+                    <a:blip r:embed="rId12" cstate="print">
+                      <a:extLst>
+                        <a:ext uri="{28A0092B-C50C-407E-A947-70E740481C1C}">
+                          <a14:useLocalDpi xmlns:a14="http://schemas.microsoft.com/office/drawing/2010/main" val="0"/>
+                        </a:ext>
+                      </a:extLst>
+                    </a:blip>
+                    <a:stretch>
+                      <a:fillRect/>
+                    </a:stretch>
+                  </pic:blipFill>
+                  <pic:spPr>
+                    <a:xfrm>
+                      <a:off x="0" y="0"/>
+                      <a:ext cx="5219700" cy="3263900"/>
+                    </a:xfrm>
+                    <a:prstGeom prst="rect">
+                      <a:avLst/>
+                    </a:prstGeom>
+                  </pic:spPr>
+                </pic:pic>
+              </a:graphicData>
+            </a:graphic>
+          </wp:inline>
+        </w:drawing>
       </w:r>
     </w:p>
     <w:p>
@@ -13592,15 +13913,6 @@
           <w:sz w:val="20"/>
         </w:rPr>
       </w:pPr>
-      <w:r>
-        <w:rPr>
-          <w:rFonts w:ascii="Times New Roman" w:hAnsi="Times New Roman" w:cs="Times New Roman"/>
-          <w:i/>
-          <w:color w:val="000000"/>
-          <w:sz w:val="20"/>
-        </w:rPr>
-        <w:t>[Gambar 5.3: Halaman Daftar Buku - sisipkan screenshot]</w:t>
-      </w:r>
     </w:p>
     <w:p>
       <w:pPr>
@@ -13620,7 +13932,7 @@
           <w:color w:val="000000"/>
           <w:sz w:val="20"/>
         </w:rPr>
-        <w:t>[Gambar 5.4: Halaman Tambah Buku - sisipkan screenshot]</w:t>
+        <w:t>Gambar 5.3 Halaman Daftar Buku</w:t>
       </w:r>
     </w:p>
     <w:p>
@@ -13638,10 +13950,236 @@
         <w:rPr>
           <w:rFonts w:ascii="Times New Roman" w:hAnsi="Times New Roman" w:cs="Times New Roman"/>
           <w:i/>
+          <w:noProof/>
           <w:color w:val="000000"/>
           <w:sz w:val="20"/>
         </w:rPr>
-        <w:t>[Gambar 5.5: Halaman Daftar Anggota - sisipkan screenshot]</w:t>
+        <w:drawing>
+          <wp:inline distT="0" distB="0" distL="0" distR="0" wp14:anchorId="66EB3924" wp14:editId="1EE20CFB">
+            <wp:extent cx="5219700" cy="5930900"/>
+            <wp:effectExtent l="0" t="0" r="0" b="0"/>
+            <wp:docPr id="1082744105" name="Picture 5"/>
+            <wp:cNvGraphicFramePr/>
+            <a:graphic xmlns:a="http://schemas.openxmlformats.org/drawingml/2006/main">
+              <a:graphicData uri="http://schemas.openxmlformats.org/drawingml/2006/picture">
+                <pic:pic xmlns:pic="http://schemas.openxmlformats.org/drawingml/2006/picture">
+                  <pic:nvPicPr>
+                    <pic:cNvPr id="1082744105" name=""/>
+                    <pic:cNvPicPr/>
+                  </pic:nvPicPr>
+                  <pic:blipFill>
+                    <a:blip r:embed="rId13" cstate="print">
+                      <a:extLst>
+                        <a:ext uri="{28A0092B-C50C-407E-A947-70E740481C1C}">
+                          <a14:useLocalDpi xmlns:a14="http://schemas.microsoft.com/office/drawing/2010/main" val="0"/>
+                        </a:ext>
+                      </a:extLst>
+                    </a:blip>
+                    <a:stretch>
+                      <a:fillRect/>
+                    </a:stretch>
+                  </pic:blipFill>
+                  <pic:spPr>
+                    <a:xfrm>
+                      <a:off x="0" y="0"/>
+                      <a:ext cx="5219700" cy="5930900"/>
+                    </a:xfrm>
+                    <a:prstGeom prst="rect">
+                      <a:avLst/>
+                    </a:prstGeom>
+                  </pic:spPr>
+                </pic:pic>
+              </a:graphicData>
+            </a:graphic>
+          </wp:inline>
+        </w:drawing>
+      </w:r>
+    </w:p>
+    <w:p>
+      <w:pPr>
+        <w:spacing w:after="120" w:line="240" w:lineRule="auto"/>
+        <w:jc w:val="center"/>
+        <w:rPr>
+          <w:rFonts w:ascii="Times New Roman" w:hAnsi="Times New Roman" w:cs="Times New Roman"/>
+          <w:i/>
+          <w:color w:val="000000"/>
+          <w:sz w:val="20"/>
+        </w:rPr>
+      </w:pPr>
+    </w:p>
+    <w:p>
+      <w:pPr>
+        <w:spacing w:after="120" w:line="240" w:lineRule="auto"/>
+        <w:jc w:val="center"/>
+        <w:rPr>
+          <w:rFonts w:ascii="Times New Roman" w:hAnsi="Times New Roman" w:cs="Times New Roman"/>
+          <w:i/>
+          <w:color w:val="000000"/>
+          <w:sz w:val="20"/>
+        </w:rPr>
+      </w:pPr>
+      <w:r>
+        <w:rPr>
+          <w:rFonts w:ascii="Times New Roman" w:hAnsi="Times New Roman" w:cs="Times New Roman"/>
+          <w:i/>
+          <w:color w:val="000000"/>
+          <w:sz w:val="20"/>
+        </w:rPr>
+        <w:t>Gambar 5.4 Halaman Tambah Buku</w:t>
+      </w:r>
+    </w:p>
+    <w:p>
+      <w:pPr>
+        <w:spacing w:after="120" w:line="240" w:lineRule="auto"/>
+        <w:jc w:val="center"/>
+        <w:rPr>
+          <w:rFonts w:ascii="Times New Roman" w:hAnsi="Times New Roman" w:cs="Times New Roman"/>
+          <w:i/>
+          <w:color w:val="000000"/>
+          <w:sz w:val="20"/>
+        </w:rPr>
+      </w:pPr>
+      <w:r>
+        <w:rPr>
+          <w:rFonts w:ascii="Times New Roman" w:hAnsi="Times New Roman" w:cs="Times New Roman"/>
+          <w:i/>
+          <w:noProof/>
+          <w:color w:val="000000"/>
+          <w:sz w:val="20"/>
+        </w:rPr>
+        <w:lastRenderedPageBreak/>
+        <w:drawing>
+          <wp:inline distT="0" distB="0" distL="0" distR="0" wp14:anchorId="167449C5" wp14:editId="651CD9F2">
+            <wp:extent cx="5219700" cy="3263900"/>
+            <wp:effectExtent l="0" t="0" r="0" b="0"/>
+            <wp:docPr id="1214216368" name="Picture 6"/>
+            <wp:cNvGraphicFramePr/>
+            <a:graphic xmlns:a="http://schemas.openxmlformats.org/drawingml/2006/main">
+              <a:graphicData uri="http://schemas.openxmlformats.org/drawingml/2006/picture">
+                <pic:pic xmlns:pic="http://schemas.openxmlformats.org/drawingml/2006/picture">
+                  <pic:nvPicPr>
+                    <pic:cNvPr id="1214216368" name=""/>
+                    <pic:cNvPicPr/>
+                  </pic:nvPicPr>
+                  <pic:blipFill>
+                    <a:blip r:embed="rId14" cstate="print">
+                      <a:extLst>
+                        <a:ext uri="{28A0092B-C50C-407E-A947-70E740481C1C}">
+                          <a14:useLocalDpi xmlns:a14="http://schemas.microsoft.com/office/drawing/2010/main" val="0"/>
+                        </a:ext>
+                      </a:extLst>
+                    </a:blip>
+                    <a:stretch>
+                      <a:fillRect/>
+                    </a:stretch>
+                  </pic:blipFill>
+                  <pic:spPr>
+                    <a:xfrm>
+                      <a:off x="0" y="0"/>
+                      <a:ext cx="5219700" cy="3263900"/>
+                    </a:xfrm>
+                    <a:prstGeom prst="rect">
+                      <a:avLst/>
+                    </a:prstGeom>
+                  </pic:spPr>
+                </pic:pic>
+              </a:graphicData>
+            </a:graphic>
+          </wp:inline>
+        </w:drawing>
+      </w:r>
+    </w:p>
+    <w:p>
+      <w:pPr>
+        <w:spacing w:after="120" w:line="240" w:lineRule="auto"/>
+        <w:jc w:val="center"/>
+        <w:rPr>
+          <w:rFonts w:ascii="Times New Roman" w:hAnsi="Times New Roman" w:cs="Times New Roman"/>
+          <w:i/>
+          <w:color w:val="000000"/>
+          <w:sz w:val="20"/>
+        </w:rPr>
+      </w:pPr>
+    </w:p>
+    <w:p>
+      <w:pPr>
+        <w:spacing w:after="120" w:line="240" w:lineRule="auto"/>
+        <w:jc w:val="center"/>
+        <w:rPr>
+          <w:rFonts w:ascii="Times New Roman" w:hAnsi="Times New Roman" w:cs="Times New Roman"/>
+          <w:i/>
+          <w:color w:val="000000"/>
+          <w:sz w:val="20"/>
+        </w:rPr>
+      </w:pPr>
+      <w:r>
+        <w:rPr>
+          <w:rFonts w:ascii="Times New Roman" w:hAnsi="Times New Roman" w:cs="Times New Roman"/>
+          <w:i/>
+          <w:color w:val="000000"/>
+          <w:sz w:val="20"/>
+        </w:rPr>
+        <w:t>Gambar 5.5 Halaman Daftar Anggota</w:t>
+      </w:r>
+    </w:p>
+    <w:p>
+      <w:pPr>
+        <w:spacing w:after="120" w:line="240" w:lineRule="auto"/>
+        <w:jc w:val="center"/>
+        <w:rPr>
+          <w:rFonts w:ascii="Times New Roman" w:hAnsi="Times New Roman" w:cs="Times New Roman"/>
+          <w:i/>
+          <w:color w:val="000000"/>
+          <w:sz w:val="20"/>
+        </w:rPr>
+      </w:pPr>
+      <w:r>
+        <w:rPr>
+          <w:rFonts w:ascii="Times New Roman" w:hAnsi="Times New Roman" w:cs="Times New Roman"/>
+          <w:i/>
+          <w:noProof/>
+          <w:color w:val="000000"/>
+          <w:sz w:val="20"/>
+        </w:rPr>
+        <w:drawing>
+          <wp:inline distT="0" distB="0" distL="0" distR="0" wp14:anchorId="666C8861" wp14:editId="732B7462">
+            <wp:extent cx="5219700" cy="3263900"/>
+            <wp:effectExtent l="0" t="0" r="0" b="0"/>
+            <wp:docPr id="1525092859" name="Picture 7"/>
+            <wp:cNvGraphicFramePr/>
+            <a:graphic xmlns:a="http://schemas.openxmlformats.org/drawingml/2006/main">
+              <a:graphicData uri="http://schemas.openxmlformats.org/drawingml/2006/picture">
+                <pic:pic xmlns:pic="http://schemas.openxmlformats.org/drawingml/2006/picture">
+                  <pic:nvPicPr>
+                    <pic:cNvPr id="1525092859" name=""/>
+                    <pic:cNvPicPr/>
+                  </pic:nvPicPr>
+                  <pic:blipFill>
+                    <a:blip r:embed="rId15" cstate="print">
+                      <a:extLst>
+                        <a:ext uri="{28A0092B-C50C-407E-A947-70E740481C1C}">
+                          <a14:useLocalDpi xmlns:a14="http://schemas.microsoft.com/office/drawing/2010/main" val="0"/>
+                        </a:ext>
+                      </a:extLst>
+                    </a:blip>
+                    <a:stretch>
+                      <a:fillRect/>
+                    </a:stretch>
+                  </pic:blipFill>
+                  <pic:spPr>
+                    <a:xfrm>
+                      <a:off x="0" y="0"/>
+                      <a:ext cx="5219700" cy="3263900"/>
+                    </a:xfrm>
+                    <a:prstGeom prst="rect">
+                      <a:avLst/>
+                    </a:prstGeom>
+                  </pic:spPr>
+                </pic:pic>
+              </a:graphicData>
+            </a:graphic>
+          </wp:inline>
+        </w:drawing>
       </w:r>
     </w:p>
     <w:p>
@@ -13698,15 +14236,6 @@
           <w:sz w:val="20"/>
         </w:rPr>
       </w:pPr>
-      <w:r>
-        <w:rPr>
-          <w:rFonts w:ascii="Times New Roman" w:hAnsi="Times New Roman" w:cs="Times New Roman"/>
-          <w:i/>
-          <w:color w:val="000000"/>
-          <w:sz w:val="20"/>
-        </w:rPr>
-        <w:t>[Gambar 5.6: Halaman Scan Peminjaman - sisipkan screenshot]</w:t>
-      </w:r>
     </w:p>
     <w:p>
       <w:pPr>
@@ -13726,7 +14255,160 @@
           <w:color w:val="000000"/>
           <w:sz w:val="20"/>
         </w:rPr>
-        <w:t>[Gambar 5.7: Halaman Scan Pengembalian - sisipkan screenshot]</w:t>
+        <w:t>Gambar 5.6 Halaman Scan Peminjaman</w:t>
+      </w:r>
+    </w:p>
+    <w:p>
+      <w:pPr>
+        <w:spacing w:after="120" w:line="240" w:lineRule="auto"/>
+        <w:jc w:val="center"/>
+        <w:rPr>
+          <w:rFonts w:ascii="Times New Roman" w:hAnsi="Times New Roman" w:cs="Times New Roman"/>
+          <w:i/>
+          <w:color w:val="000000"/>
+          <w:sz w:val="20"/>
+        </w:rPr>
+      </w:pPr>
+      <w:r>
+        <w:rPr>
+          <w:rFonts w:ascii="Times New Roman" w:hAnsi="Times New Roman" w:cs="Times New Roman"/>
+          <w:i/>
+          <w:noProof/>
+          <w:color w:val="000000"/>
+          <w:sz w:val="20"/>
+        </w:rPr>
+        <w:drawing>
+          <wp:inline distT="0" distB="0" distL="0" distR="0" wp14:anchorId="328386D4" wp14:editId="360B8649">
+            <wp:extent cx="5219700" cy="3263900"/>
+            <wp:effectExtent l="0" t="0" r="0" b="0"/>
+            <wp:docPr id="1399081727" name="Picture 8"/>
+            <wp:cNvGraphicFramePr/>
+            <a:graphic xmlns:a="http://schemas.openxmlformats.org/drawingml/2006/main">
+              <a:graphicData uri="http://schemas.openxmlformats.org/drawingml/2006/picture">
+                <pic:pic xmlns:pic="http://schemas.openxmlformats.org/drawingml/2006/picture">
+                  <pic:nvPicPr>
+                    <pic:cNvPr id="1399081727" name=""/>
+                    <pic:cNvPicPr/>
+                  </pic:nvPicPr>
+                  <pic:blipFill>
+                    <a:blip r:embed="rId16" cstate="print">
+                      <a:extLst>
+                        <a:ext uri="{28A0092B-C50C-407E-A947-70E740481C1C}">
+                          <a14:useLocalDpi xmlns:a14="http://schemas.microsoft.com/office/drawing/2010/main" val="0"/>
+                        </a:ext>
+                      </a:extLst>
+                    </a:blip>
+                    <a:stretch>
+                      <a:fillRect/>
+                    </a:stretch>
+                  </pic:blipFill>
+                  <pic:spPr>
+                    <a:xfrm>
+                      <a:off x="0" y="0"/>
+                      <a:ext cx="5219700" cy="3263900"/>
+                    </a:xfrm>
+                    <a:prstGeom prst="rect">
+                      <a:avLst/>
+                    </a:prstGeom>
+                  </pic:spPr>
+                </pic:pic>
+              </a:graphicData>
+            </a:graphic>
+          </wp:inline>
+        </w:drawing>
+      </w:r>
+    </w:p>
+    <w:p>
+      <w:pPr>
+        <w:spacing w:after="120" w:line="240" w:lineRule="auto"/>
+        <w:jc w:val="center"/>
+        <w:rPr>
+          <w:rFonts w:ascii="Times New Roman" w:hAnsi="Times New Roman" w:cs="Times New Roman"/>
+          <w:i/>
+          <w:color w:val="000000"/>
+          <w:sz w:val="20"/>
+        </w:rPr>
+      </w:pPr>
+    </w:p>
+    <w:p>
+      <w:pPr>
+        <w:spacing w:after="120" w:line="240" w:lineRule="auto"/>
+        <w:jc w:val="center"/>
+        <w:rPr>
+          <w:rFonts w:ascii="Times New Roman" w:hAnsi="Times New Roman" w:cs="Times New Roman"/>
+          <w:i/>
+          <w:color w:val="000000"/>
+          <w:sz w:val="20"/>
+        </w:rPr>
+      </w:pPr>
+      <w:r>
+        <w:rPr>
+          <w:rFonts w:ascii="Times New Roman" w:hAnsi="Times New Roman" w:cs="Times New Roman"/>
+          <w:i/>
+          <w:color w:val="000000"/>
+          <w:sz w:val="20"/>
+        </w:rPr>
+        <w:t>Gambar 5.7 Halaman Scan Pengembalian</w:t>
+      </w:r>
+    </w:p>
+    <w:p>
+      <w:pPr>
+        <w:spacing w:after="120" w:line="240" w:lineRule="auto"/>
+        <w:jc w:val="center"/>
+        <w:rPr>
+          <w:rFonts w:ascii="Times New Roman" w:hAnsi="Times New Roman" w:cs="Times New Roman"/>
+          <w:i/>
+          <w:color w:val="000000"/>
+          <w:sz w:val="20"/>
+        </w:rPr>
+      </w:pPr>
+      <w:r>
+        <w:rPr>
+          <w:rFonts w:ascii="Times New Roman" w:hAnsi="Times New Roman" w:cs="Times New Roman"/>
+          <w:i/>
+          <w:noProof/>
+          <w:color w:val="000000"/>
+          <w:sz w:val="20"/>
+        </w:rPr>
+        <w:drawing>
+          <wp:inline distT="0" distB="0" distL="0" distR="0" wp14:anchorId="3A7F10FA" wp14:editId="67F82760">
+            <wp:extent cx="5219700" cy="3263900"/>
+            <wp:effectExtent l="0" t="0" r="0" b="0"/>
+            <wp:docPr id="1475060611" name="Picture 9"/>
+            <wp:cNvGraphicFramePr/>
+            <a:graphic xmlns:a="http://schemas.openxmlformats.org/drawingml/2006/main">
+              <a:graphicData uri="http://schemas.openxmlformats.org/drawingml/2006/picture">
+                <pic:pic xmlns:pic="http://schemas.openxmlformats.org/drawingml/2006/picture">
+                  <pic:nvPicPr>
+                    <pic:cNvPr id="1475060611" name=""/>
+                    <pic:cNvPicPr/>
+                  </pic:nvPicPr>
+                  <pic:blipFill>
+                    <a:blip r:embed="rId17" cstate="print">
+                      <a:extLst>
+                        <a:ext uri="{28A0092B-C50C-407E-A947-70E740481C1C}">
+                          <a14:useLocalDpi xmlns:a14="http://schemas.microsoft.com/office/drawing/2010/main" val="0"/>
+                        </a:ext>
+                      </a:extLst>
+                    </a:blip>
+                    <a:stretch>
+                      <a:fillRect/>
+                    </a:stretch>
+                  </pic:blipFill>
+                  <pic:spPr>
+                    <a:xfrm>
+                      <a:off x="0" y="0"/>
+                      <a:ext cx="5219700" cy="3263900"/>
+                    </a:xfrm>
+                    <a:prstGeom prst="rect">
+                      <a:avLst/>
+                    </a:prstGeom>
+                  </pic:spPr>
+                </pic:pic>
+              </a:graphicData>
+            </a:graphic>
+          </wp:inline>
+        </w:drawing>
       </w:r>
     </w:p>
     <w:p>
@@ -13794,7 +14476,16 @@
           <w:color w:val="000000"/>
           <w:sz w:val="24"/>
         </w:rPr>
-        <w:t>Ketika buku dikembalikan, sistem menghitung selisih hari antara tanggal jatuh tempo dan tanggal pengembalian. Denda dihitung sebesar Rp500 per hari keterlambatan dengan batas maksimal Rp5.000. Besaran denda ditampilkan kepada petugas sebelum pengembalian disimpan.</w:t>
+        <w:t xml:space="preserve">Ketika buku dikembalikan, sistem menghitung selisih hari antara tanggal jatuh tempo dan tanggal pengembalian. Denda dihitung sebesar Rp500 per hari </w:t>
+      </w:r>
+      <w:r>
+        <w:rPr>
+          <w:rFonts w:ascii="Times New Roman" w:hAnsi="Times New Roman" w:cs="Times New Roman"/>
+          <w:color w:val="000000"/>
+          <w:sz w:val="24"/>
+        </w:rPr>
+        <w:lastRenderedPageBreak/>
+        <w:t>keterlambatan dengan batas maksimal Rp5.000. Besaran denda ditampilkan kepada petugas sebelum pengembalian disimpan.</w:t>
       </w:r>
     </w:p>
     <w:p>
@@ -13898,14 +14589,86 @@
           <w:sz w:val="20"/>
         </w:rPr>
       </w:pPr>
-      <w:r>
+    </w:p>
+    <w:p>
+      <w:pPr>
+        <w:spacing w:after="120" w:line="240" w:lineRule="auto"/>
+        <w:jc w:val="center"/>
         <w:rPr>
           <w:rFonts w:ascii="Times New Roman" w:hAnsi="Times New Roman" w:cs="Times New Roman"/>
           <w:i/>
           <w:color w:val="000000"/>
           <w:sz w:val="20"/>
         </w:rPr>
-        <w:t>[Gambar 5.8: Halaman Dashboard Statistik - sisipkan screenshot]</w:t>
+      </w:pPr>
+      <w:r>
+        <w:rPr>
+          <w:rFonts w:ascii="Times New Roman" w:hAnsi="Times New Roman" w:cs="Times New Roman"/>
+          <w:i/>
+          <w:color w:val="000000"/>
+          <w:sz w:val="20"/>
+        </w:rPr>
+        <w:t>Gambar 5.8 Halaman Dashboard Statistik</w:t>
+      </w:r>
+    </w:p>
+    <w:p>
+      <w:pPr>
+        <w:spacing w:after="120" w:line="240" w:lineRule="auto"/>
+        <w:jc w:val="center"/>
+        <w:rPr>
+          <w:rFonts w:ascii="Times New Roman" w:hAnsi="Times New Roman" w:cs="Times New Roman"/>
+          <w:i/>
+          <w:color w:val="000000"/>
+          <w:sz w:val="20"/>
+        </w:rPr>
+      </w:pPr>
+      <w:r>
+        <w:rPr>
+          <w:rFonts w:ascii="Times New Roman" w:hAnsi="Times New Roman" w:cs="Times New Roman"/>
+          <w:i/>
+          <w:noProof/>
+          <w:color w:val="000000"/>
+          <w:sz w:val="20"/>
+        </w:rPr>
+        <w:drawing>
+          <wp:inline distT="0" distB="0" distL="0" distR="0" wp14:anchorId="1001CBD6" wp14:editId="533D0BBD">
+            <wp:extent cx="5219700" cy="3263900"/>
+            <wp:effectExtent l="0" t="0" r="0" b="0"/>
+            <wp:docPr id="1340023704" name="Picture 10"/>
+            <wp:cNvGraphicFramePr/>
+            <a:graphic xmlns:a="http://schemas.openxmlformats.org/drawingml/2006/main">
+              <a:graphicData uri="http://schemas.openxmlformats.org/drawingml/2006/picture">
+                <pic:pic xmlns:pic="http://schemas.openxmlformats.org/drawingml/2006/picture">
+                  <pic:nvPicPr>
+                    <pic:cNvPr id="1340023704" name=""/>
+                    <pic:cNvPicPr/>
+                  </pic:nvPicPr>
+                  <pic:blipFill>
+                    <a:blip r:embed="rId18" cstate="print">
+                      <a:extLst>
+                        <a:ext uri="{28A0092B-C50C-407E-A947-70E740481C1C}">
+                          <a14:useLocalDpi xmlns:a14="http://schemas.microsoft.com/office/drawing/2010/main" val="0"/>
+                        </a:ext>
+                      </a:extLst>
+                    </a:blip>
+                    <a:stretch>
+                      <a:fillRect/>
+                    </a:stretch>
+                  </pic:blipFill>
+                  <pic:spPr>
+                    <a:xfrm>
+                      <a:off x="0" y="0"/>
+                      <a:ext cx="5219700" cy="3263900"/>
+                    </a:xfrm>
+                    <a:prstGeom prst="rect">
+                      <a:avLst/>
+                    </a:prstGeom>
+                  </pic:spPr>
+                </pic:pic>
+              </a:graphicData>
+            </a:graphic>
+          </wp:inline>
+        </w:drawing>
       </w:r>
     </w:p>
     <w:p>
@@ -13993,7 +14756,16 @@
           <w:color w:val="000000"/>
           <w:sz w:val="24"/>
         </w:rPr>
-        <w:t>Aplikasi di-deploy ke platform cloud Railway. Proses deployment dilakukan secara otomatis setiap kali kode program diperbarui dan dipush ke repositori GitHub. Dengan demikian, aplikasi dapat diakses secara online melalui browser kapan saja dan dari mana saja, sehingga siap digunakan oleh pihak sekolah.</w:t>
+        <w:t xml:space="preserve">Aplikasi di-deploy ke platform cloud Railway. Proses deployment dilakukan secara otomatis setiap kali kode program diperbarui dan dipush ke </w:t>
+      </w:r>
+      <w:r>
+        <w:rPr>
+          <w:rFonts w:ascii="Times New Roman" w:hAnsi="Times New Roman" w:cs="Times New Roman"/>
+          <w:color w:val="000000"/>
+          <w:sz w:val="24"/>
+        </w:rPr>
+        <w:lastRenderedPageBreak/>
+        <w:t>repositori GitHub. Dengan demikian, aplikasi dapat diakses secara online melalui browser kapan saja dan dari mana saja, sehingga siap digunakan oleh pihak sekolah.</w:t>
       </w:r>
     </w:p>
     <w:p>
@@ -14032,6 +14804,7 @@
           <w:color w:val="000000"/>
           <w:sz w:val="28"/>
         </w:rPr>
+        <w:lastRenderedPageBreak/>
         <w:t>BAB VI</w:t>
       </w:r>
       <w:bookmarkEnd w:id="53"/>
@@ -14358,7 +15131,15 @@
                 <w:rFonts w:ascii="Times New Roman" w:hAnsi="Times New Roman" w:cs="Times New Roman"/>
                 <w:color w:val="000000"/>
               </w:rPr>
-              <w:t>Memasukkan email dan kata sandi yang valid</w:t>
+              <w:t>Memasukkan email dan kata sa</w:t>
+            </w:r>
+            <w:r>
+              <w:rPr>
+                <w:rFonts w:ascii="Times New Roman" w:hAnsi="Times New Roman" w:cs="Times New Roman"/>
+                <w:color w:val="000000"/>
+              </w:rPr>
+              <w:lastRenderedPageBreak/>
+              <w:t>ndi yang valid</w:t>
             </w:r>
           </w:p>
         </w:tc>
@@ -14380,7 +15161,16 @@
                 <w:rFonts w:ascii="Times New Roman" w:hAnsi="Times New Roman" w:cs="Times New Roman"/>
                 <w:color w:val="000000"/>
               </w:rPr>
-              <w:t>Pengguna masuk ke halaman dashboard</w:t>
+              <w:lastRenderedPageBreak/>
+              <w:t xml:space="preserve">Pengguna masuk ke halaman </w:t>
+            </w:r>
+            <w:r>
+              <w:rPr>
+                <w:rFonts w:ascii="Times New Roman" w:hAnsi="Times New Roman" w:cs="Times New Roman"/>
+                <w:color w:val="000000"/>
+              </w:rPr>
+              <w:lastRenderedPageBreak/>
+              <w:t>dashboard</w:t>
             </w:r>
           </w:p>
         </w:tc>
@@ -14402,6 +15192,7 @@
                 <w:rFonts w:ascii="Times New Roman" w:hAnsi="Times New Roman" w:cs="Times New Roman"/>
                 <w:color w:val="000000"/>
               </w:rPr>
+              <w:lastRenderedPageBreak/>
               <w:t>Sesuai (Valid)</w:t>
             </w:r>
           </w:p>
@@ -14588,7 +15379,15 @@
                 <w:rFonts w:ascii="Times New Roman" w:hAnsi="Times New Roman" w:cs="Times New Roman"/>
                 <w:color w:val="000000"/>
               </w:rPr>
-              <w:t>Membuka menu Buku</w:t>
+              <w:t>Membuka menu Bu</w:t>
+            </w:r>
+            <w:r>
+              <w:rPr>
+                <w:rFonts w:ascii="Times New Roman" w:hAnsi="Times New Roman" w:cs="Times New Roman"/>
+                <w:color w:val="000000"/>
+              </w:rPr>
+              <w:lastRenderedPageBreak/>
+              <w:t>ku</w:t>
             </w:r>
           </w:p>
         </w:tc>
@@ -14610,7 +15409,16 @@
                 <w:rFonts w:ascii="Times New Roman" w:hAnsi="Times New Roman" w:cs="Times New Roman"/>
                 <w:color w:val="000000"/>
               </w:rPr>
-              <w:t>Daftar buku beserta QR Code tampil</w:t>
+              <w:lastRenderedPageBreak/>
+              <w:t xml:space="preserve">Daftar buku beserta QR </w:t>
+            </w:r>
+            <w:r>
+              <w:rPr>
+                <w:rFonts w:ascii="Times New Roman" w:hAnsi="Times New Roman" w:cs="Times New Roman"/>
+                <w:color w:val="000000"/>
+              </w:rPr>
+              <w:lastRenderedPageBreak/>
+              <w:t>Code tampil</w:t>
             </w:r>
           </w:p>
         </w:tc>
@@ -14632,6 +15440,7 @@
                 <w:rFonts w:ascii="Times New Roman" w:hAnsi="Times New Roman" w:cs="Times New Roman"/>
                 <w:color w:val="000000"/>
               </w:rPr>
+              <w:lastRenderedPageBreak/>
               <w:t>Sesuai (Valid)</w:t>
             </w:r>
           </w:p>
@@ -14818,7 +15627,15 @@
                 <w:rFonts w:ascii="Times New Roman" w:hAnsi="Times New Roman" w:cs="Times New Roman"/>
                 <w:color w:val="000000"/>
               </w:rPr>
-              <w:t>Admin mengubah dan menghapus data buku</w:t>
+              <w:t>Admin mengubah dan me</w:t>
+            </w:r>
+            <w:r>
+              <w:rPr>
+                <w:rFonts w:ascii="Times New Roman" w:hAnsi="Times New Roman" w:cs="Times New Roman"/>
+                <w:color w:val="000000"/>
+              </w:rPr>
+              <w:lastRenderedPageBreak/>
+              <w:t>nghapus data buku</w:t>
             </w:r>
           </w:p>
         </w:tc>
@@ -14840,7 +15657,16 @@
                 <w:rFonts w:ascii="Times New Roman" w:hAnsi="Times New Roman" w:cs="Times New Roman"/>
                 <w:color w:val="000000"/>
               </w:rPr>
-              <w:t>Data buku terupdate dan terhapus</w:t>
+              <w:lastRenderedPageBreak/>
+              <w:t>Data buku terupdate dan te</w:t>
+            </w:r>
+            <w:r>
+              <w:rPr>
+                <w:rFonts w:ascii="Times New Roman" w:hAnsi="Times New Roman" w:cs="Times New Roman"/>
+                <w:color w:val="000000"/>
+              </w:rPr>
+              <w:lastRenderedPageBreak/>
+              <w:t>rhapus</w:t>
             </w:r>
           </w:p>
         </w:tc>
@@ -14862,6 +15688,7 @@
                 <w:rFonts w:ascii="Times New Roman" w:hAnsi="Times New Roman" w:cs="Times New Roman"/>
                 <w:color w:val="000000"/>
               </w:rPr>
+              <w:lastRenderedPageBreak/>
               <w:t>Sesuai (Valid)</w:t>
             </w:r>
           </w:p>
@@ -15026,7 +15853,15 @@
                 <w:rFonts w:ascii="Times New Roman" w:hAnsi="Times New Roman" w:cs="Times New Roman"/>
                 <w:color w:val="000000"/>
               </w:rPr>
-              <w:t>Peminjaman Stok Habis</w:t>
+              <w:t>Peminjaman Sto</w:t>
+            </w:r>
+            <w:r>
+              <w:rPr>
+                <w:rFonts w:ascii="Times New Roman" w:hAnsi="Times New Roman" w:cs="Times New Roman"/>
+                <w:color w:val="000000"/>
+              </w:rPr>
+              <w:lastRenderedPageBreak/>
+              <w:t>k Habis</w:t>
             </w:r>
           </w:p>
         </w:tc>
@@ -15048,7 +15883,16 @@
                 <w:rFonts w:ascii="Times New Roman" w:hAnsi="Times New Roman" w:cs="Times New Roman"/>
                 <w:color w:val="000000"/>
               </w:rPr>
-              <w:t>Meminjam buku dengan stok 0</w:t>
+              <w:lastRenderedPageBreak/>
+              <w:t xml:space="preserve">Meminjam buku </w:t>
+            </w:r>
+            <w:r>
+              <w:rPr>
+                <w:rFonts w:ascii="Times New Roman" w:hAnsi="Times New Roman" w:cs="Times New Roman"/>
+                <w:color w:val="000000"/>
+              </w:rPr>
+              <w:lastRenderedPageBreak/>
+              <w:t>dengan stok 0</w:t>
             </w:r>
           </w:p>
         </w:tc>
@@ -15070,7 +15914,16 @@
                 <w:rFonts w:ascii="Times New Roman" w:hAnsi="Times New Roman" w:cs="Times New Roman"/>
                 <w:color w:val="000000"/>
               </w:rPr>
-              <w:t>Sistem menolak dan menampilkan peringatan</w:t>
+              <w:lastRenderedPageBreak/>
+              <w:t xml:space="preserve">Sistem menolak </w:t>
+            </w:r>
+            <w:r>
+              <w:rPr>
+                <w:rFonts w:ascii="Times New Roman" w:hAnsi="Times New Roman" w:cs="Times New Roman"/>
+                <w:color w:val="000000"/>
+              </w:rPr>
+              <w:lastRenderedPageBreak/>
+              <w:t>dan menampilkan peringatan</w:t>
             </w:r>
           </w:p>
         </w:tc>
@@ -15092,6 +15945,7 @@
                 <w:rFonts w:ascii="Times New Roman" w:hAnsi="Times New Roman" w:cs="Times New Roman"/>
                 <w:color w:val="000000"/>
               </w:rPr>
+              <w:lastRenderedPageBreak/>
               <w:t>Sesuai (Valid)</w:t>
             </w:r>
           </w:p>
@@ -15256,7 +16110,15 @@
                 <w:rFonts w:ascii="Times New Roman" w:hAnsi="Times New Roman" w:cs="Times New Roman"/>
                 <w:color w:val="000000"/>
               </w:rPr>
-              <w:t>Denda Keterlambatan</w:t>
+              <w:t>Den</w:t>
+            </w:r>
+            <w:r>
+              <w:rPr>
+                <w:rFonts w:ascii="Times New Roman" w:hAnsi="Times New Roman" w:cs="Times New Roman"/>
+                <w:color w:val="000000"/>
+              </w:rPr>
+              <w:lastRenderedPageBreak/>
+              <w:t>da Keterlambatan</w:t>
             </w:r>
           </w:p>
         </w:tc>
@@ -15278,7 +16140,16 @@
                 <w:rFonts w:ascii="Times New Roman" w:hAnsi="Times New Roman" w:cs="Times New Roman"/>
                 <w:color w:val="000000"/>
               </w:rPr>
-              <w:t>Mengembalikan buku melewati jatuh tempo</w:t>
+              <w:lastRenderedPageBreak/>
+              <w:t>Men</w:t>
+            </w:r>
+            <w:r>
+              <w:rPr>
+                <w:rFonts w:ascii="Times New Roman" w:hAnsi="Times New Roman" w:cs="Times New Roman"/>
+                <w:color w:val="000000"/>
+              </w:rPr>
+              <w:lastRenderedPageBreak/>
+              <w:t>gembalikan buku melewati jatuh tempo</w:t>
             </w:r>
           </w:p>
         </w:tc>
@@ -15300,7 +16171,16 @@
                 <w:rFonts w:ascii="Times New Roman" w:hAnsi="Times New Roman" w:cs="Times New Roman"/>
                 <w:color w:val="000000"/>
               </w:rPr>
-              <w:t>Denda terhitung Rp500/hari maks Rp5.000</w:t>
+              <w:lastRenderedPageBreak/>
+              <w:t>Den</w:t>
+            </w:r>
+            <w:r>
+              <w:rPr>
+                <w:rFonts w:ascii="Times New Roman" w:hAnsi="Times New Roman" w:cs="Times New Roman"/>
+                <w:color w:val="000000"/>
+              </w:rPr>
+              <w:lastRenderedPageBreak/>
+              <w:t>da terhitung Rp500/hari maks Rp5.000</w:t>
             </w:r>
           </w:p>
         </w:tc>
@@ -15322,7 +16202,16 @@
                 <w:rFonts w:ascii="Times New Roman" w:hAnsi="Times New Roman" w:cs="Times New Roman"/>
                 <w:color w:val="000000"/>
               </w:rPr>
-              <w:t>Sesuai (Valid)</w:t>
+              <w:lastRenderedPageBreak/>
+              <w:t>Sesu</w:t>
+            </w:r>
+            <w:r>
+              <w:rPr>
+                <w:rFonts w:ascii="Times New Roman" w:hAnsi="Times New Roman" w:cs="Times New Roman"/>
+                <w:color w:val="000000"/>
+              </w:rPr>
+              <w:lastRenderedPageBreak/>
+              <w:t>ai (Valid)</w:t>
             </w:r>
           </w:p>
         </w:tc>
@@ -15349,6 +16238,7 @@
                 <w:rFonts w:ascii="Times New Roman" w:hAnsi="Times New Roman" w:cs="Times New Roman"/>
                 <w:color w:val="000000"/>
               </w:rPr>
+              <w:lastRenderedPageBreak/>
               <w:t>10</w:t>
             </w:r>
           </w:p>
@@ -15393,7 +16283,15 @@
                 <w:rFonts w:ascii="Times New Roman" w:hAnsi="Times New Roman" w:cs="Times New Roman"/>
                 <w:color w:val="000000"/>
               </w:rPr>
-              <w:t>Submit pengembalian tanpa centang konfirmasi</w:t>
+              <w:t>Submit pengembalian tanpa centang k</w:t>
+            </w:r>
+            <w:r>
+              <w:rPr>
+                <w:rFonts w:ascii="Times New Roman" w:hAnsi="Times New Roman" w:cs="Times New Roman"/>
+                <w:color w:val="000000"/>
+              </w:rPr>
+              <w:lastRenderedPageBreak/>
+              <w:t>onfirmasi</w:t>
             </w:r>
           </w:p>
         </w:tc>
@@ -15415,6 +16313,7 @@
                 <w:rFonts w:ascii="Times New Roman" w:hAnsi="Times New Roman" w:cs="Times New Roman"/>
                 <w:color w:val="000000"/>
               </w:rPr>
+              <w:lastRenderedPageBreak/>
               <w:t>Sistem menolak pengembalian</w:t>
             </w:r>
           </w:p>
@@ -15623,7 +16522,15 @@
                 <w:rFonts w:ascii="Times New Roman" w:hAnsi="Times New Roman" w:cs="Times New Roman"/>
                 <w:color w:val="000000"/>
               </w:rPr>
-              <w:t>Membuka halaman dashboard</w:t>
+              <w:t>Membuka halaman dash</w:t>
+            </w:r>
+            <w:r>
+              <w:rPr>
+                <w:rFonts w:ascii="Times New Roman" w:hAnsi="Times New Roman" w:cs="Times New Roman"/>
+                <w:color w:val="000000"/>
+              </w:rPr>
+              <w:lastRenderedPageBreak/>
+              <w:t>board</w:t>
             </w:r>
           </w:p>
         </w:tc>
@@ -15645,7 +16552,16 @@
                 <w:rFonts w:ascii="Times New Roman" w:hAnsi="Times New Roman" w:cs="Times New Roman"/>
                 <w:color w:val="000000"/>
               </w:rPr>
-              <w:t>Statistik dan grafik Chart.js tampil</w:t>
+              <w:lastRenderedPageBreak/>
+              <w:t xml:space="preserve">Statistik dan grafik Chart.js </w:t>
+            </w:r>
+            <w:r>
+              <w:rPr>
+                <w:rFonts w:ascii="Times New Roman" w:hAnsi="Times New Roman" w:cs="Times New Roman"/>
+                <w:color w:val="000000"/>
+              </w:rPr>
+              <w:lastRenderedPageBreak/>
+              <w:t>tampil</w:t>
             </w:r>
           </w:p>
         </w:tc>
@@ -15667,6 +16583,7 @@
                 <w:rFonts w:ascii="Times New Roman" w:hAnsi="Times New Roman" w:cs="Times New Roman"/>
                 <w:color w:val="000000"/>
               </w:rPr>
+              <w:lastRenderedPageBreak/>
               <w:t>Sesuai (Valid)</w:t>
             </w:r>
           </w:p>
@@ -15946,7 +16863,15 @@
                 <w:rFonts w:ascii="Times New Roman" w:hAnsi="Times New Roman" w:cs="Times New Roman"/>
                 <w:color w:val="000000"/>
               </w:rPr>
-              <w:t>Pembatasan Hak Akses</w:t>
+              <w:t>Pem</w:t>
+            </w:r>
+            <w:r>
+              <w:rPr>
+                <w:rFonts w:ascii="Times New Roman" w:hAnsi="Times New Roman" w:cs="Times New Roman"/>
+                <w:color w:val="000000"/>
+              </w:rPr>
+              <w:lastRenderedPageBreak/>
+              <w:t>batasan Hak Akses</w:t>
             </w:r>
           </w:p>
         </w:tc>
@@ -15968,7 +16893,16 @@
                 <w:rFonts w:ascii="Times New Roman" w:hAnsi="Times New Roman" w:cs="Times New Roman"/>
                 <w:color w:val="000000"/>
               </w:rPr>
-              <w:t>Login sebagai Anggota lalu membuka menu pengelolaan anggota</w:t>
+              <w:lastRenderedPageBreak/>
+              <w:t>Logi</w:t>
+            </w:r>
+            <w:r>
+              <w:rPr>
+                <w:rFonts w:ascii="Times New Roman" w:hAnsi="Times New Roman" w:cs="Times New Roman"/>
+                <w:color w:val="000000"/>
+              </w:rPr>
+              <w:lastRenderedPageBreak/>
+              <w:t>n sebagai Anggota lalu membuka menu pengelolaan anggota</w:t>
             </w:r>
           </w:p>
         </w:tc>
@@ -15990,7 +16924,16 @@
                 <w:rFonts w:ascii="Times New Roman" w:hAnsi="Times New Roman" w:cs="Times New Roman"/>
                 <w:color w:val="000000"/>
               </w:rPr>
-              <w:t>Sistem menolak akses (halaman 403)</w:t>
+              <w:lastRenderedPageBreak/>
+              <w:t>Siste</w:t>
+            </w:r>
+            <w:r>
+              <w:rPr>
+                <w:rFonts w:ascii="Times New Roman" w:hAnsi="Times New Roman" w:cs="Times New Roman"/>
+                <w:color w:val="000000"/>
+              </w:rPr>
+              <w:lastRenderedPageBreak/>
+              <w:t>m menolak akses (halaman 403)</w:t>
             </w:r>
           </w:p>
         </w:tc>
@@ -16012,7 +16955,16 @@
                 <w:rFonts w:ascii="Times New Roman" w:hAnsi="Times New Roman" w:cs="Times New Roman"/>
                 <w:color w:val="000000"/>
               </w:rPr>
-              <w:t>Sesuai (Valid)</w:t>
+              <w:lastRenderedPageBreak/>
+              <w:t>Sesu</w:t>
+            </w:r>
+            <w:r>
+              <w:rPr>
+                <w:rFonts w:ascii="Times New Roman" w:hAnsi="Times New Roman" w:cs="Times New Roman"/>
+                <w:color w:val="000000"/>
+              </w:rPr>
+              <w:lastRenderedPageBreak/>
+              <w:t>ai (Valid)</w:t>
             </w:r>
           </w:p>
         </w:tc>
@@ -16039,6 +16991,7 @@
                 <w:rFonts w:ascii="Times New Roman" w:hAnsi="Times New Roman" w:cs="Times New Roman"/>
                 <w:color w:val="000000"/>
               </w:rPr>
+              <w:lastRenderedPageBreak/>
               <w:t>16</w:t>
             </w:r>
           </w:p>
@@ -16083,7 +17036,15 @@
                 <w:rFonts w:ascii="Times New Roman" w:hAnsi="Times New Roman" w:cs="Times New Roman"/>
                 <w:color w:val="000000"/>
               </w:rPr>
-              <w:t>Admin menambah, mengubah, dan menghapus anggota</w:t>
+              <w:t xml:space="preserve">Admin menambah, </w:t>
+            </w:r>
+            <w:r>
+              <w:rPr>
+                <w:rFonts w:ascii="Times New Roman" w:hAnsi="Times New Roman" w:cs="Times New Roman"/>
+                <w:color w:val="000000"/>
+              </w:rPr>
+              <w:lastRenderedPageBreak/>
+              <w:t>mengubah, dan menghapus anggota</w:t>
             </w:r>
           </w:p>
         </w:tc>
@@ -16105,7 +17066,16 @@
                 <w:rFonts w:ascii="Times New Roman" w:hAnsi="Times New Roman" w:cs="Times New Roman"/>
                 <w:color w:val="000000"/>
               </w:rPr>
-              <w:t>Data anggota berhasil dikelola</w:t>
+              <w:lastRenderedPageBreak/>
+              <w:t>Data anggota berh</w:t>
+            </w:r>
+            <w:r>
+              <w:rPr>
+                <w:rFonts w:ascii="Times New Roman" w:hAnsi="Times New Roman" w:cs="Times New Roman"/>
+                <w:color w:val="000000"/>
+              </w:rPr>
+              <w:lastRenderedPageBreak/>
+              <w:t>asil dikelola</w:t>
             </w:r>
           </w:p>
         </w:tc>
@@ -16127,6 +17097,7 @@
                 <w:rFonts w:ascii="Times New Roman" w:hAnsi="Times New Roman" w:cs="Times New Roman"/>
                 <w:color w:val="000000"/>
               </w:rPr>
+              <w:lastRenderedPageBreak/>
               <w:t>Sesuai (Valid)</w:t>
             </w:r>
           </w:p>
@@ -16198,7 +17169,15 @@
                 <w:rFonts w:ascii="Times New Roman" w:hAnsi="Times New Roman" w:cs="Times New Roman"/>
                 <w:color w:val="000000"/>
               </w:rPr>
-              <w:t>Mengetik kata kunci dan memilih filter status</w:t>
+              <w:t>Mengetik kata kunci dan memilih filter stat</w:t>
+            </w:r>
+            <w:r>
+              <w:rPr>
+                <w:rFonts w:ascii="Times New Roman" w:hAnsi="Times New Roman" w:cs="Times New Roman"/>
+                <w:color w:val="000000"/>
+              </w:rPr>
+              <w:lastRenderedPageBreak/>
+              <w:t>us</w:t>
             </w:r>
           </w:p>
         </w:tc>
@@ -16220,6 +17199,7 @@
                 <w:rFonts w:ascii="Times New Roman" w:hAnsi="Times New Roman" w:cs="Times New Roman"/>
                 <w:color w:val="000000"/>
               </w:rPr>
+              <w:lastRenderedPageBreak/>
               <w:t>Hasil pencarian dan filter tampil sesuai</w:t>
             </w:r>
           </w:p>
@@ -16475,6 +17455,7 @@
           <w:color w:val="000000"/>
           <w:sz w:val="28"/>
         </w:rPr>
+        <w:lastRenderedPageBreak/>
         <w:t>BAB VII</w:t>
       </w:r>
       <w:bookmarkEnd w:id="58"/>
@@ -16968,6 +17949,7 @@
                 <w:rFonts w:ascii="Times New Roman" w:hAnsi="Times New Roman" w:cs="Times New Roman"/>
                 <w:color w:val="000000"/>
               </w:rPr>
+              <w:lastRenderedPageBreak/>
               <w:t>4</w:t>
             </w:r>
           </w:p>
@@ -17478,6 +18460,7 @@
                 <w:rFonts w:ascii="Times New Roman" w:hAnsi="Times New Roman" w:cs="Times New Roman"/>
                 <w:color w:val="000000"/>
               </w:rPr>
+              <w:lastRenderedPageBreak/>
               <w:t>Internet</w:t>
             </w:r>
           </w:p>
@@ -18099,6 +19082,7 @@
                 <w:b/>
                 <w:color w:val="000000"/>
               </w:rPr>
+              <w:lastRenderedPageBreak/>
               <w:t>Uraian</w:t>
             </w:r>
           </w:p>
@@ -18728,6 +19712,7 @@
           <w:color w:val="000000"/>
           <w:sz w:val="24"/>
         </w:rPr>
+        <w:lastRenderedPageBreak/>
         <w:t>Biaya tetap per bulan = biaya internet Rp 300.000 + listrik Rp 100.000 + promosi Rp 40.000 = Rp 440.000.</w:t>
       </w:r>
     </w:p>
@@ -18847,6 +19832,7 @@
           <w:color w:val="000000"/>
           <w:sz w:val="28"/>
         </w:rPr>
+        <w:lastRenderedPageBreak/>
         <w:t>BAB VIII</w:t>
       </w:r>
       <w:bookmarkEnd w:id="65"/>
@@ -19195,6 +20181,7 @@
           <w:color w:val="000000"/>
           <w:sz w:val="28"/>
         </w:rPr>
+        <w:lastRenderedPageBreak/>
         <w:t>BAB IX</w:t>
       </w:r>
       <w:bookmarkEnd w:id="72"/>
@@ -19633,6 +20620,7 @@
           <w:color w:val="000000"/>
           <w:sz w:val="28"/>
         </w:rPr>
+        <w:lastRenderedPageBreak/>
         <w:t>BAB X</w:t>
       </w:r>
       <w:bookmarkEnd w:id="77"/>
@@ -19962,6 +20950,7 @@
           <w:color w:val="000000"/>
           <w:sz w:val="28"/>
         </w:rPr>
+        <w:lastRenderedPageBreak/>
         <w:t>LAMPIRAN</w:t>
       </w:r>
       <w:bookmarkEnd w:id="81"/>
@@ -20105,15 +21094,6 @@
           <w:sz w:val="20"/>
         </w:rPr>
       </w:pPr>
-      <w:r>
-        <w:rPr>
-          <w:rFonts w:ascii="Times New Roman" w:hAnsi="Times New Roman" w:cs="Times New Roman"/>
-          <w:i/>
-          <w:color w:val="000000"/>
-          <w:sz w:val="20"/>
-        </w:rPr>
-        <w:t>[Gambar A.1: Halaman Login]</w:t>
-      </w:r>
     </w:p>
     <w:p>
       <w:pPr>
@@ -20133,7 +21113,7 @@
           <w:color w:val="000000"/>
           <w:sz w:val="20"/>
         </w:rPr>
-        <w:t>[Gambar A.2: Dashboard]</w:t>
+        <w:t>Gambar A.1 Halaman Login</w:t>
       </w:r>
     </w:p>
     <w:p>
@@ -20151,10 +21131,49 @@
         <w:rPr>
           <w:rFonts w:ascii="Times New Roman" w:hAnsi="Times New Roman" w:cs="Times New Roman"/>
           <w:i/>
+          <w:noProof/>
           <w:color w:val="000000"/>
           <w:sz w:val="20"/>
         </w:rPr>
-        <w:t>[Gambar A.3: Daftar Buku]</w:t>
+        <w:drawing>
+          <wp:inline distT="0" distB="0" distL="0" distR="0" wp14:anchorId="18C5FE79" wp14:editId="39322187">
+            <wp:extent cx="5219700" cy="3263900"/>
+            <wp:effectExtent l="0" t="0" r="0" b="0"/>
+            <wp:docPr id="482783707" name="Picture 11"/>
+            <wp:cNvGraphicFramePr/>
+            <a:graphic xmlns:a="http://schemas.openxmlformats.org/drawingml/2006/main">
+              <a:graphicData uri="http://schemas.openxmlformats.org/drawingml/2006/picture">
+                <pic:pic xmlns:pic="http://schemas.openxmlformats.org/drawingml/2006/picture">
+                  <pic:nvPicPr>
+                    <pic:cNvPr id="482783707" name=""/>
+                    <pic:cNvPicPr/>
+                  </pic:nvPicPr>
+                  <pic:blipFill>
+                    <a:blip r:embed="rId11" cstate="print">
+                      <a:extLst>
+                        <a:ext uri="{28A0092B-C50C-407E-A947-70E740481C1C}">
+                          <a14:useLocalDpi xmlns:a14="http://schemas.microsoft.com/office/drawing/2010/main" val="0"/>
+                        </a:ext>
+                      </a:extLst>
+                    </a:blip>
+                    <a:stretch>
+                      <a:fillRect/>
+                    </a:stretch>
+                  </pic:blipFill>
+                  <pic:spPr>
+                    <a:xfrm>
+                      <a:off x="0" y="0"/>
+                      <a:ext cx="5219700" cy="3263900"/>
+                    </a:xfrm>
+                    <a:prstGeom prst="rect">
+                      <a:avLst/>
+                    </a:prstGeom>
+                  </pic:spPr>
+                </pic:pic>
+              </a:graphicData>
+            </a:graphic>
+          </wp:inline>
+        </w:drawing>
       </w:r>
     </w:p>
     <w:p>
@@ -20168,15 +21187,6 @@
           <w:sz w:val="20"/>
         </w:rPr>
       </w:pPr>
-      <w:r>
-        <w:rPr>
-          <w:rFonts w:ascii="Times New Roman" w:hAnsi="Times New Roman" w:cs="Times New Roman"/>
-          <w:i/>
-          <w:color w:val="000000"/>
-          <w:sz w:val="20"/>
-        </w:rPr>
-        <w:t>[Gambar A.4: Scan Peminjaman]</w:t>
-      </w:r>
     </w:p>
     <w:p>
       <w:pPr>
@@ -20196,7 +21206,7 @@
           <w:color w:val="000000"/>
           <w:sz w:val="20"/>
         </w:rPr>
-        <w:t>[Gambar A.5: Scan Pengembalian dan Denda]</w:t>
+        <w:t>Gambar A.2 Dashboard</w:t>
       </w:r>
     </w:p>
     <w:p>
@@ -20214,10 +21224,50 @@
         <w:rPr>
           <w:rFonts w:ascii="Times New Roman" w:hAnsi="Times New Roman" w:cs="Times New Roman"/>
           <w:i/>
+          <w:noProof/>
           <w:color w:val="000000"/>
           <w:sz w:val="20"/>
         </w:rPr>
-        <w:t>[Gambar A.6: Riwayat Peminjaman]</w:t>
+        <w:lastRenderedPageBreak/>
+        <w:drawing>
+          <wp:inline distT="0" distB="0" distL="0" distR="0" wp14:anchorId="37F14442" wp14:editId="4FACF4A4">
+            <wp:extent cx="5219700" cy="3860800"/>
+            <wp:effectExtent l="0" t="0" r="0" b="6350"/>
+            <wp:docPr id="424258111" name="Picture 12"/>
+            <wp:cNvGraphicFramePr/>
+            <a:graphic xmlns:a="http://schemas.openxmlformats.org/drawingml/2006/main">
+              <a:graphicData uri="http://schemas.openxmlformats.org/drawingml/2006/picture">
+                <pic:pic xmlns:pic="http://schemas.openxmlformats.org/drawingml/2006/picture">
+                  <pic:nvPicPr>
+                    <pic:cNvPr id="424258111" name=""/>
+                    <pic:cNvPicPr/>
+                  </pic:nvPicPr>
+                  <pic:blipFill>
+                    <a:blip r:embed="rId19" cstate="print">
+                      <a:extLst>
+                        <a:ext uri="{28A0092B-C50C-407E-A947-70E740481C1C}">
+                          <a14:useLocalDpi xmlns:a14="http://schemas.microsoft.com/office/drawing/2010/main" val="0"/>
+                        </a:ext>
+                      </a:extLst>
+                    </a:blip>
+                    <a:stretch>
+                      <a:fillRect/>
+                    </a:stretch>
+                  </pic:blipFill>
+                  <pic:spPr>
+                    <a:xfrm>
+                      <a:off x="0" y="0"/>
+                      <a:ext cx="5219700" cy="3860800"/>
+                    </a:xfrm>
+                    <a:prstGeom prst="rect">
+                      <a:avLst/>
+                    </a:prstGeom>
+                  </pic:spPr>
+                </pic:pic>
+              </a:graphicData>
+            </a:graphic>
+          </wp:inline>
+        </w:drawing>
       </w:r>
     </w:p>
     <w:p>
@@ -20231,14 +21281,461 @@
           <w:sz w:val="20"/>
         </w:rPr>
       </w:pPr>
-      <w:r>
+    </w:p>
+    <w:p>
+      <w:pPr>
+        <w:spacing w:after="120" w:line="240" w:lineRule="auto"/>
+        <w:jc w:val="center"/>
         <w:rPr>
           <w:rFonts w:ascii="Times New Roman" w:hAnsi="Times New Roman" w:cs="Times New Roman"/>
           <w:i/>
           <w:color w:val="000000"/>
           <w:sz w:val="20"/>
         </w:rPr>
-        <w:t>[Gambar A.7: Pengelolaan Anggota]</w:t>
+      </w:pPr>
+      <w:r>
+        <w:rPr>
+          <w:rFonts w:ascii="Times New Roman" w:hAnsi="Times New Roman" w:cs="Times New Roman"/>
+          <w:i/>
+          <w:color w:val="000000"/>
+          <w:sz w:val="20"/>
+        </w:rPr>
+        <w:t>Gambar A.3 Daftar Buku</w:t>
+      </w:r>
+    </w:p>
+    <w:p>
+      <w:pPr>
+        <w:spacing w:after="120" w:line="240" w:lineRule="auto"/>
+        <w:jc w:val="center"/>
+        <w:rPr>
+          <w:rFonts w:ascii="Times New Roman" w:hAnsi="Times New Roman" w:cs="Times New Roman"/>
+          <w:i/>
+          <w:color w:val="000000"/>
+          <w:sz w:val="20"/>
+        </w:rPr>
+      </w:pPr>
+      <w:r>
+        <w:rPr>
+          <w:rFonts w:ascii="Times New Roman" w:hAnsi="Times New Roman" w:cs="Times New Roman"/>
+          <w:i/>
+          <w:noProof/>
+          <w:color w:val="000000"/>
+          <w:sz w:val="20"/>
+        </w:rPr>
+        <w:lastRenderedPageBreak/>
+        <w:drawing>
+          <wp:inline distT="0" distB="0" distL="0" distR="0" wp14:anchorId="7FCF1BC1" wp14:editId="1A9E8DA7">
+            <wp:extent cx="5219700" cy="5930900"/>
+            <wp:effectExtent l="0" t="0" r="0" b="0"/>
+            <wp:docPr id="1623297522" name="Picture 13"/>
+            <wp:cNvGraphicFramePr/>
+            <a:graphic xmlns:a="http://schemas.openxmlformats.org/drawingml/2006/main">
+              <a:graphicData uri="http://schemas.openxmlformats.org/drawingml/2006/picture">
+                <pic:pic xmlns:pic="http://schemas.openxmlformats.org/drawingml/2006/picture">
+                  <pic:nvPicPr>
+                    <pic:cNvPr id="1623297522" name=""/>
+                    <pic:cNvPicPr/>
+                  </pic:nvPicPr>
+                  <pic:blipFill>
+                    <a:blip r:embed="rId13" cstate="print">
+                      <a:extLst>
+                        <a:ext uri="{28A0092B-C50C-407E-A947-70E740481C1C}">
+                          <a14:useLocalDpi xmlns:a14="http://schemas.microsoft.com/office/drawing/2010/main" val="0"/>
+                        </a:ext>
+                      </a:extLst>
+                    </a:blip>
+                    <a:stretch>
+                      <a:fillRect/>
+                    </a:stretch>
+                  </pic:blipFill>
+                  <pic:spPr>
+                    <a:xfrm>
+                      <a:off x="0" y="0"/>
+                      <a:ext cx="5219700" cy="5930900"/>
+                    </a:xfrm>
+                    <a:prstGeom prst="rect">
+                      <a:avLst/>
+                    </a:prstGeom>
+                  </pic:spPr>
+                </pic:pic>
+              </a:graphicData>
+            </a:graphic>
+          </wp:inline>
+        </w:drawing>
+      </w:r>
+    </w:p>
+    <w:p>
+      <w:pPr>
+        <w:spacing w:after="120" w:line="240" w:lineRule="auto"/>
+        <w:jc w:val="center"/>
+        <w:rPr>
+          <w:rFonts w:ascii="Times New Roman" w:hAnsi="Times New Roman" w:cs="Times New Roman"/>
+          <w:i/>
+          <w:color w:val="000000"/>
+          <w:sz w:val="20"/>
+        </w:rPr>
+      </w:pPr>
+    </w:p>
+    <w:p>
+      <w:pPr>
+        <w:spacing w:after="120" w:line="240" w:lineRule="auto"/>
+        <w:jc w:val="center"/>
+        <w:rPr>
+          <w:rFonts w:ascii="Times New Roman" w:hAnsi="Times New Roman" w:cs="Times New Roman"/>
+          <w:i/>
+          <w:color w:val="000000"/>
+          <w:sz w:val="20"/>
+        </w:rPr>
+      </w:pPr>
+      <w:r>
+        <w:rPr>
+          <w:rFonts w:ascii="Times New Roman" w:hAnsi="Times New Roman" w:cs="Times New Roman"/>
+          <w:i/>
+          <w:color w:val="000000"/>
+          <w:sz w:val="20"/>
+        </w:rPr>
+        <w:t>Gambar A.4 Scan Peminjaman</w:t>
+      </w:r>
+    </w:p>
+    <w:p>
+      <w:pPr>
+        <w:spacing w:after="120" w:line="240" w:lineRule="auto"/>
+        <w:jc w:val="center"/>
+        <w:rPr>
+          <w:rFonts w:ascii="Times New Roman" w:hAnsi="Times New Roman" w:cs="Times New Roman"/>
+          <w:i/>
+          <w:color w:val="000000"/>
+          <w:sz w:val="20"/>
+        </w:rPr>
+      </w:pPr>
+      <w:r>
+        <w:rPr>
+          <w:rFonts w:ascii="Times New Roman" w:hAnsi="Times New Roman" w:cs="Times New Roman"/>
+          <w:i/>
+          <w:noProof/>
+          <w:color w:val="000000"/>
+          <w:sz w:val="20"/>
+        </w:rPr>
+        <w:lastRenderedPageBreak/>
+        <w:drawing>
+          <wp:inline distT="0" distB="0" distL="0" distR="0" wp14:anchorId="65106476" wp14:editId="76684EA9">
+            <wp:extent cx="5219700" cy="3263900"/>
+            <wp:effectExtent l="0" t="0" r="0" b="0"/>
+            <wp:docPr id="84542355" name="Picture 14"/>
+            <wp:cNvGraphicFramePr/>
+            <a:graphic xmlns:a="http://schemas.openxmlformats.org/drawingml/2006/main">
+              <a:graphicData uri="http://schemas.openxmlformats.org/drawingml/2006/picture">
+                <pic:pic xmlns:pic="http://schemas.openxmlformats.org/drawingml/2006/picture">
+                  <pic:nvPicPr>
+                    <pic:cNvPr id="84542355" name=""/>
+                    <pic:cNvPicPr/>
+                  </pic:nvPicPr>
+                  <pic:blipFill>
+                    <a:blip r:embed="rId16" cstate="print">
+                      <a:extLst>
+                        <a:ext uri="{28A0092B-C50C-407E-A947-70E740481C1C}">
+                          <a14:useLocalDpi xmlns:a14="http://schemas.microsoft.com/office/drawing/2010/main" val="0"/>
+                        </a:ext>
+                      </a:extLst>
+                    </a:blip>
+                    <a:stretch>
+                      <a:fillRect/>
+                    </a:stretch>
+                  </pic:blipFill>
+                  <pic:spPr>
+                    <a:xfrm>
+                      <a:off x="0" y="0"/>
+                      <a:ext cx="5219700" cy="3263900"/>
+                    </a:xfrm>
+                    <a:prstGeom prst="rect">
+                      <a:avLst/>
+                    </a:prstGeom>
+                  </pic:spPr>
+                </pic:pic>
+              </a:graphicData>
+            </a:graphic>
+          </wp:inline>
+        </w:drawing>
+      </w:r>
+    </w:p>
+    <w:p>
+      <w:pPr>
+        <w:spacing w:after="120" w:line="240" w:lineRule="auto"/>
+        <w:jc w:val="center"/>
+        <w:rPr>
+          <w:rFonts w:ascii="Times New Roman" w:hAnsi="Times New Roman" w:cs="Times New Roman"/>
+          <w:i/>
+          <w:color w:val="000000"/>
+          <w:sz w:val="20"/>
+        </w:rPr>
+      </w:pPr>
+    </w:p>
+    <w:p>
+      <w:pPr>
+        <w:spacing w:after="120" w:line="240" w:lineRule="auto"/>
+        <w:jc w:val="center"/>
+        <w:rPr>
+          <w:rFonts w:ascii="Times New Roman" w:hAnsi="Times New Roman" w:cs="Times New Roman"/>
+          <w:i/>
+          <w:color w:val="000000"/>
+          <w:sz w:val="20"/>
+        </w:rPr>
+      </w:pPr>
+      <w:r>
+        <w:rPr>
+          <w:rFonts w:ascii="Times New Roman" w:hAnsi="Times New Roman" w:cs="Times New Roman"/>
+          <w:i/>
+          <w:color w:val="000000"/>
+          <w:sz w:val="20"/>
+        </w:rPr>
+        <w:t>Gambar A.5 Scan Pengembalian dan Denda</w:t>
+      </w:r>
+    </w:p>
+    <w:p>
+      <w:pPr>
+        <w:spacing w:after="120" w:line="240" w:lineRule="auto"/>
+        <w:jc w:val="center"/>
+        <w:rPr>
+          <w:rFonts w:ascii="Times New Roman" w:hAnsi="Times New Roman" w:cs="Times New Roman"/>
+          <w:i/>
+          <w:color w:val="000000"/>
+          <w:sz w:val="20"/>
+        </w:rPr>
+      </w:pPr>
+      <w:r>
+        <w:rPr>
+          <w:rFonts w:ascii="Times New Roman" w:hAnsi="Times New Roman" w:cs="Times New Roman"/>
+          <w:i/>
+          <w:noProof/>
+          <w:color w:val="000000"/>
+          <w:sz w:val="20"/>
+        </w:rPr>
+        <w:drawing>
+          <wp:inline distT="0" distB="0" distL="0" distR="0" wp14:anchorId="7B78B1AA" wp14:editId="35937E7D">
+            <wp:extent cx="5219700" cy="3263900"/>
+            <wp:effectExtent l="0" t="0" r="0" b="0"/>
+            <wp:docPr id="1753643799" name="Picture 15"/>
+            <wp:cNvGraphicFramePr/>
+            <a:graphic xmlns:a="http://schemas.openxmlformats.org/drawingml/2006/main">
+              <a:graphicData uri="http://schemas.openxmlformats.org/drawingml/2006/picture">
+                <pic:pic xmlns:pic="http://schemas.openxmlformats.org/drawingml/2006/picture">
+                  <pic:nvPicPr>
+                    <pic:cNvPr id="1753643799" name=""/>
+                    <pic:cNvPicPr/>
+                  </pic:nvPicPr>
+                  <pic:blipFill>
+                    <a:blip r:embed="rId17" cstate="print">
+                      <a:extLst>
+                        <a:ext uri="{28A0092B-C50C-407E-A947-70E740481C1C}">
+                          <a14:useLocalDpi xmlns:a14="http://schemas.microsoft.com/office/drawing/2010/main" val="0"/>
+                        </a:ext>
+                      </a:extLst>
+                    </a:blip>
+                    <a:stretch>
+                      <a:fillRect/>
+                    </a:stretch>
+                  </pic:blipFill>
+                  <pic:spPr>
+                    <a:xfrm>
+                      <a:off x="0" y="0"/>
+                      <a:ext cx="5219700" cy="3263900"/>
+                    </a:xfrm>
+                    <a:prstGeom prst="rect">
+                      <a:avLst/>
+                    </a:prstGeom>
+                  </pic:spPr>
+                </pic:pic>
+              </a:graphicData>
+            </a:graphic>
+          </wp:inline>
+        </w:drawing>
+      </w:r>
+    </w:p>
+    <w:p>
+      <w:pPr>
+        <w:spacing w:after="120" w:line="240" w:lineRule="auto"/>
+        <w:jc w:val="center"/>
+        <w:rPr>
+          <w:rFonts w:ascii="Times New Roman" w:hAnsi="Times New Roman" w:cs="Times New Roman"/>
+          <w:i/>
+          <w:color w:val="000000"/>
+          <w:sz w:val="20"/>
+        </w:rPr>
+      </w:pPr>
+    </w:p>
+    <w:p>
+      <w:pPr>
+        <w:spacing w:after="120" w:line="240" w:lineRule="auto"/>
+        <w:jc w:val="center"/>
+        <w:rPr>
+          <w:rFonts w:ascii="Times New Roman" w:hAnsi="Times New Roman" w:cs="Times New Roman"/>
+          <w:i/>
+          <w:color w:val="000000"/>
+          <w:sz w:val="20"/>
+        </w:rPr>
+      </w:pPr>
+      <w:r>
+        <w:rPr>
+          <w:rFonts w:ascii="Times New Roman" w:hAnsi="Times New Roman" w:cs="Times New Roman"/>
+          <w:i/>
+          <w:color w:val="000000"/>
+          <w:sz w:val="20"/>
+        </w:rPr>
+        <w:t>Gambar A.6 Riwayat Peminjaman</w:t>
+      </w:r>
+    </w:p>
+    <w:p>
+      <w:pPr>
+        <w:spacing w:after="120" w:line="240" w:lineRule="auto"/>
+        <w:jc w:val="center"/>
+        <w:rPr>
+          <w:rFonts w:ascii="Times New Roman" w:hAnsi="Times New Roman" w:cs="Times New Roman"/>
+          <w:i/>
+          <w:color w:val="000000"/>
+          <w:sz w:val="20"/>
+        </w:rPr>
+      </w:pPr>
+      <w:r>
+        <w:rPr>
+          <w:rFonts w:ascii="Times New Roman" w:hAnsi="Times New Roman" w:cs="Times New Roman"/>
+          <w:i/>
+          <w:noProof/>
+          <w:color w:val="000000"/>
+          <w:sz w:val="20"/>
+        </w:rPr>
+        <w:lastRenderedPageBreak/>
+        <w:drawing>
+          <wp:inline distT="0" distB="0" distL="0" distR="0" wp14:anchorId="13BDF79A" wp14:editId="0C3A59CB">
+            <wp:extent cx="5219700" cy="3340100"/>
+            <wp:effectExtent l="0" t="0" r="0" b="0"/>
+            <wp:docPr id="56042355" name="Picture 16"/>
+            <wp:cNvGraphicFramePr/>
+            <a:graphic xmlns:a="http://schemas.openxmlformats.org/drawingml/2006/main">
+              <a:graphicData uri="http://schemas.openxmlformats.org/drawingml/2006/picture">
+                <pic:pic xmlns:pic="http://schemas.openxmlformats.org/drawingml/2006/picture">
+                  <pic:nvPicPr>
+                    <pic:cNvPr id="56042355" name=""/>
+                    <pic:cNvPicPr/>
+                  </pic:nvPicPr>
+                  <pic:blipFill>
+                    <a:blip r:embed="rId20" cstate="print">
+                      <a:extLst>
+                        <a:ext uri="{28A0092B-C50C-407E-A947-70E740481C1C}">
+                          <a14:useLocalDpi xmlns:a14="http://schemas.microsoft.com/office/drawing/2010/main" val="0"/>
+                        </a:ext>
+                      </a:extLst>
+                    </a:blip>
+                    <a:stretch>
+                      <a:fillRect/>
+                    </a:stretch>
+                  </pic:blipFill>
+                  <pic:spPr>
+                    <a:xfrm>
+                      <a:off x="0" y="0"/>
+                      <a:ext cx="5219700" cy="3340100"/>
+                    </a:xfrm>
+                    <a:prstGeom prst="rect">
+                      <a:avLst/>
+                    </a:prstGeom>
+                  </pic:spPr>
+                </pic:pic>
+              </a:graphicData>
+            </a:graphic>
+          </wp:inline>
+        </w:drawing>
+      </w:r>
+    </w:p>
+    <w:p>
+      <w:pPr>
+        <w:spacing w:after="120" w:line="240" w:lineRule="auto"/>
+        <w:jc w:val="center"/>
+        <w:rPr>
+          <w:rFonts w:ascii="Times New Roman" w:hAnsi="Times New Roman" w:cs="Times New Roman"/>
+          <w:i/>
+          <w:color w:val="000000"/>
+          <w:sz w:val="20"/>
+        </w:rPr>
+      </w:pPr>
+    </w:p>
+    <w:p>
+      <w:pPr>
+        <w:spacing w:after="120" w:line="240" w:lineRule="auto"/>
+        <w:jc w:val="center"/>
+        <w:rPr>
+          <w:rFonts w:ascii="Times New Roman" w:hAnsi="Times New Roman" w:cs="Times New Roman"/>
+          <w:i/>
+          <w:color w:val="000000"/>
+          <w:sz w:val="20"/>
+        </w:rPr>
+      </w:pPr>
+      <w:r>
+        <w:rPr>
+          <w:rFonts w:ascii="Times New Roman" w:hAnsi="Times New Roman" w:cs="Times New Roman"/>
+          <w:i/>
+          <w:color w:val="000000"/>
+          <w:sz w:val="20"/>
+        </w:rPr>
+        <w:t>Gambar A.7 Pengelolaan Anggota</w:t>
+      </w:r>
+    </w:p>
+    <w:p>
+      <w:pPr>
+        <w:spacing w:after="120" w:line="240" w:lineRule="auto"/>
+        <w:jc w:val="center"/>
+        <w:rPr>
+          <w:rFonts w:ascii="Times New Roman" w:hAnsi="Times New Roman" w:cs="Times New Roman"/>
+          <w:i/>
+          <w:color w:val="000000"/>
+          <w:sz w:val="20"/>
+        </w:rPr>
+      </w:pPr>
+      <w:r>
+        <w:rPr>
+          <w:rFonts w:ascii="Times New Roman" w:hAnsi="Times New Roman" w:cs="Times New Roman"/>
+          <w:i/>
+          <w:noProof/>
+          <w:color w:val="000000"/>
+          <w:sz w:val="20"/>
+        </w:rPr>
+        <w:drawing>
+          <wp:inline distT="0" distB="0" distL="0" distR="0" wp14:anchorId="180B96DC" wp14:editId="1FE0C034">
+            <wp:extent cx="5219700" cy="3263900"/>
+            <wp:effectExtent l="0" t="0" r="0" b="0"/>
+            <wp:docPr id="260759638" name="Picture 17"/>
+            <wp:cNvGraphicFramePr/>
+            <a:graphic xmlns:a="http://schemas.openxmlformats.org/drawingml/2006/main">
+              <a:graphicData uri="http://schemas.openxmlformats.org/drawingml/2006/picture">
+                <pic:pic xmlns:pic="http://schemas.openxmlformats.org/drawingml/2006/picture">
+                  <pic:nvPicPr>
+                    <pic:cNvPr id="260759638" name=""/>
+                    <pic:cNvPicPr/>
+                  </pic:nvPicPr>
+                  <pic:blipFill>
+                    <a:blip r:embed="rId15" cstate="print">
+                      <a:extLst>
+                        <a:ext uri="{28A0092B-C50C-407E-A947-70E740481C1C}">
+                          <a14:useLocalDpi xmlns:a14="http://schemas.microsoft.com/office/drawing/2010/main" val="0"/>
+                        </a:ext>
+                      </a:extLst>
+                    </a:blip>
+                    <a:stretch>
+                      <a:fillRect/>
+                    </a:stretch>
+                  </pic:blipFill>
+                  <pic:spPr>
+                    <a:xfrm>
+                      <a:off x="0" y="0"/>
+                      <a:ext cx="5219700" cy="3263900"/>
+                    </a:xfrm>
+                    <a:prstGeom prst="rect">
+                      <a:avLst/>
+                    </a:prstGeom>
+                  </pic:spPr>
+                </pic:pic>
+              </a:graphicData>
+            </a:graphic>
+          </wp:inline>
+        </w:drawing>
       </w:r>
     </w:p>
     <w:p>
@@ -20470,6 +21967,7 @@
           <w:color w:val="000000"/>
           <w:sz w:val="28"/>
         </w:rPr>
+        <w:lastRenderedPageBreak/>
         <w:t>DAFTAR PUSTAKA</w:t>
       </w:r>
       <w:bookmarkEnd w:id="86"/>
@@ -20598,12 +22096,12 @@
       </w:pPr>
     </w:p>
     <w:sectPr>
-      <w:headerReference w:type="even" r:id="rId9"/>
-      <w:headerReference w:type="default" r:id="rId10"/>
-      <w:footerReference w:type="even" r:id="rId11"/>
-      <w:footerReference w:type="default" r:id="rId12"/>
-      <w:headerReference w:type="first" r:id="rId13"/>
-      <w:footerReference w:type="first" r:id="rId14"/>
+      <w:headerReference w:type="even" r:id="rId21"/>
+      <w:headerReference w:type="default" r:id="rId22"/>
+      <w:footerReference w:type="even" r:id="rId23"/>
+      <w:footerReference w:type="default" r:id="rId24"/>
+      <w:headerReference w:type="first" r:id="rId25"/>
+      <w:footerReference w:type="first" r:id="rId26"/>
       <w:pgSz w:w="11907" w:h="16839"/>
       <w:pgMar w:top="1701" w:right="1701" w:bottom="1701" w:left="2268" w:header="720" w:footer="720" w:gutter="0"/>
       <w:cols w:space="720"/>

</xml_diff>